<commit_message>
small fixings in guide documents and powerpoint slide deck
</commit_message>
<xml_diff>
--- a/Module 2 - Agentic AI Applications/Labs/code-based/Kiro/MLU-EEP-M2-L2.4-Lab_Guide_Strands_Agent_Chat_with_Kiro.docx
+++ b/Module 2 - Agentic AI Applications/Labs/code-based/Kiro/MLU-EEP-M2-L2.4-Lab_Guide_Strands_Agent_Chat_with_Kiro.docx
@@ -15,7 +15,7 @@
           <w:noProof/>
         </w:rPr>
         <w:drawing>
-          <wp:inline distT="0" distB="0" distL="0" distR="0" wp14:anchorId="303DDCC4" wp14:editId="03D64232">
+          <wp:inline distT="0" distB="0" distL="0" distR="0" wp14:anchorId="303DDCC4" wp14:editId="2085A49F">
             <wp:extent cx="5943600" cy="1064895"/>
             <wp:effectExtent l="0" t="0" r="0" b="0"/>
             <wp:docPr id="1261789502" name="Picture 1"/>
@@ -405,7 +405,27 @@
           <w:sz w:val="24"/>
           <w:szCs w:val="24"/>
         </w:rPr>
-        <w:t xml:space="preserve">, an AI-powered IDE, to build a fully functional multi-agent AI chat application from scratch. Instead of writing code manually, you will leverage </w:t>
+        <w:t xml:space="preserve">, an AI-powered IDE, to </w:t>
+      </w:r>
+      <w:proofErr w:type="spellStart"/>
+      <w:r>
+        <w:rPr>
+          <w:rFonts w:asciiTheme="minorHAnsi" w:hAnsiTheme="minorHAnsi" w:cs="Calibri"/>
+          <w:color w:val="1A1A1A"/>
+          <w:sz w:val="24"/>
+          <w:szCs w:val="24"/>
+        </w:rPr>
+        <w:t>buil</w:t>
+      </w:r>
+      <w:proofErr w:type="spellEnd"/>
+      <w:r>
+        <w:rPr>
+          <w:rFonts w:asciiTheme="minorHAnsi" w:hAnsiTheme="minorHAnsi" w:cs="Calibri"/>
+          <w:color w:val="1A1A1A"/>
+          <w:sz w:val="24"/>
+          <w:szCs w:val="24"/>
+        </w:rPr>
+        <w:t xml:space="preserve">. Instead of writing code manually, you will leverage </w:t>
       </w:r>
       <w:r>
         <w:rPr>
@@ -496,25 +516,7 @@
             <w:sz w:val="24"/>
             <w:szCs w:val="24"/>
           </w:rPr>
-          <w:t>https://github.com/aws-mlu/aws-</w:t>
-        </w:r>
-        <w:r>
-          <w:rPr>
-            <w:rStyle w:val="Hyperlink"/>
-            <w:rFonts w:asciiTheme="minorHAnsi" w:hAnsiTheme="minorHAnsi" w:cs="Calibri"/>
-            <w:sz w:val="24"/>
-            <w:szCs w:val="24"/>
-          </w:rPr>
-          <w:t>m</w:t>
-        </w:r>
-        <w:r>
-          <w:rPr>
-            <w:rStyle w:val="Hyperlink"/>
-            <w:rFonts w:asciiTheme="minorHAnsi" w:hAnsiTheme="minorHAnsi" w:cs="Calibri"/>
-            <w:sz w:val="24"/>
-            <w:szCs w:val="24"/>
-          </w:rPr>
-          <w:t>lu-eep-generative-ai</w:t>
+          <w:t>https://github.com/aws-mlu/aws-mlu-eep-generative-ai</w:t>
         </w:r>
       </w:hyperlink>
     </w:p>
@@ -1813,13 +1815,23 @@
               </w:rPr>
               <w:t xml:space="preserve">Configured with access to Amazon Bedrock. Run </w:t>
             </w:r>
+            <w:proofErr w:type="spellStart"/>
             <w:r>
               <w:rPr>
                 <w:rStyle w:val="HTMLCode"/>
                 <w:rFonts w:asciiTheme="minorHAnsi" w:hAnsiTheme="minorHAnsi"/>
                 <w:color w:val="1A1A1A"/>
               </w:rPr>
-              <w:t>aws configure</w:t>
+              <w:t>aws</w:t>
+            </w:r>
+            <w:proofErr w:type="spellEnd"/>
+            <w:r>
+              <w:rPr>
+                <w:rStyle w:val="HTMLCode"/>
+                <w:rFonts w:asciiTheme="minorHAnsi" w:hAnsiTheme="minorHAnsi"/>
+                <w:color w:val="1A1A1A"/>
+              </w:rPr>
+              <w:t xml:space="preserve"> configure</w:t>
             </w:r>
             <w:r>
               <w:rPr>
@@ -2653,6 +2665,7 @@
                 <w:szCs w:val="20"/>
               </w:rPr>
             </w:pPr>
+            <w:proofErr w:type="spellStart"/>
             <w:r>
               <w:rPr>
                 <w:rStyle w:val="HTMLCode"/>
@@ -2660,6 +2673,7 @@
               </w:rPr>
               <w:t>python_repl</w:t>
             </w:r>
+            <w:proofErr w:type="spellEnd"/>
           </w:p>
         </w:tc>
         <w:tc>
@@ -2731,6 +2745,7 @@
                 <w:szCs w:val="20"/>
               </w:rPr>
             </w:pPr>
+            <w:proofErr w:type="spellStart"/>
             <w:r>
               <w:rPr>
                 <w:rStyle w:val="HTMLCode"/>
@@ -2738,6 +2753,7 @@
               </w:rPr>
               <w:t>http_request</w:t>
             </w:r>
+            <w:proofErr w:type="spellEnd"/>
           </w:p>
         </w:tc>
         <w:tc>
@@ -3146,6 +3162,7 @@
         </w:rPr>
         <w:t xml:space="preserve"> </w:t>
       </w:r>
+      <w:proofErr w:type="spellStart"/>
       <w:r>
         <w:rPr>
           <w:rStyle w:val="HTMLCode"/>
@@ -3155,6 +3172,7 @@
         </w:rPr>
         <w:t>search_papers</w:t>
       </w:r>
+      <w:proofErr w:type="spellEnd"/>
       <w:r>
         <w:rPr>
           <w:rFonts w:ascii="Calibri" w:hAnsi="Calibri" w:cs="Calibri"/>
@@ -3208,6 +3226,7 @@
         </w:rPr>
         <w:t xml:space="preserve"> </w:t>
       </w:r>
+      <w:proofErr w:type="spellStart"/>
       <w:r>
         <w:rPr>
           <w:rStyle w:val="HTMLCode"/>
@@ -3217,6 +3236,7 @@
         </w:rPr>
         <w:t>http_request</w:t>
       </w:r>
+      <w:proofErr w:type="spellEnd"/>
       <w:r>
         <w:rPr>
           <w:rFonts w:ascii="Calibri" w:hAnsi="Calibri" w:cs="Calibri"/>
@@ -3231,7 +3251,23 @@
           <w:rFonts w:asciiTheme="minorHAnsi" w:hAnsiTheme="minorHAnsi" w:cs="Calibri"/>
           <w:color w:val="1A1A1A"/>
         </w:rPr>
-        <w:t>tool to query the arXiv API and Semantic Scholar API for academic papers.</w:t>
+        <w:t xml:space="preserve">tool to query the </w:t>
+      </w:r>
+      <w:proofErr w:type="spellStart"/>
+      <w:r>
+        <w:rPr>
+          <w:rFonts w:asciiTheme="minorHAnsi" w:hAnsiTheme="minorHAnsi" w:cs="Calibri"/>
+          <w:color w:val="1A1A1A"/>
+        </w:rPr>
+        <w:t>arXiv</w:t>
+      </w:r>
+      <w:proofErr w:type="spellEnd"/>
+      <w:r>
+        <w:rPr>
+          <w:rFonts w:asciiTheme="minorHAnsi" w:hAnsiTheme="minorHAnsi" w:cs="Calibri"/>
+          <w:color w:val="1A1A1A"/>
+        </w:rPr>
+        <w:t xml:space="preserve"> API and Semantic Scholar API for academic papers.</w:t>
       </w:r>
     </w:p>
     <w:p>
@@ -3365,11 +3401,47 @@
           <w:color w:val="1A1A1A"/>
         </w:rPr>
       </w:pPr>
-      <w:r>
-        <w:rPr>
-          <w:color w:val="1A1A1A"/>
-        </w:rPr>
-        <w:t>mkdir mlu-eep-strands-agent-chat</w:t>
+      <w:proofErr w:type="spellStart"/>
+      <w:r>
+        <w:rPr>
+          <w:color w:val="1A1A1A"/>
+        </w:rPr>
+        <w:t>mkdir</w:t>
+      </w:r>
+      <w:proofErr w:type="spellEnd"/>
+      <w:r>
+        <w:rPr>
+          <w:color w:val="1A1A1A"/>
+        </w:rPr>
+        <w:t xml:space="preserve"> </w:t>
+      </w:r>
+      <w:proofErr w:type="spellStart"/>
+      <w:r>
+        <w:rPr>
+          <w:color w:val="1A1A1A"/>
+        </w:rPr>
+        <w:t>mlu</w:t>
+      </w:r>
+      <w:proofErr w:type="spellEnd"/>
+      <w:r>
+        <w:rPr>
+          <w:color w:val="1A1A1A"/>
+        </w:rPr>
+        <w:t>-</w:t>
+      </w:r>
+      <w:proofErr w:type="spellStart"/>
+      <w:r>
+        <w:rPr>
+          <w:color w:val="1A1A1A"/>
+        </w:rPr>
+        <w:t>eep</w:t>
+      </w:r>
+      <w:proofErr w:type="spellEnd"/>
+      <w:r>
+        <w:rPr>
+          <w:color w:val="1A1A1A"/>
+        </w:rPr>
+        <w:t>-strands-agent-chat</w:t>
       </w:r>
     </w:p>
     <w:p>
@@ -3383,7 +3455,35 @@
         <w:rPr>
           <w:color w:val="1A1A1A"/>
         </w:rPr>
-        <w:t>cd mlu-eep-strands-agent-chat</w:t>
+        <w:t xml:space="preserve">cd </w:t>
+      </w:r>
+      <w:proofErr w:type="spellStart"/>
+      <w:r>
+        <w:rPr>
+          <w:color w:val="1A1A1A"/>
+        </w:rPr>
+        <w:t>mlu</w:t>
+      </w:r>
+      <w:proofErr w:type="spellEnd"/>
+      <w:r>
+        <w:rPr>
+          <w:color w:val="1A1A1A"/>
+        </w:rPr>
+        <w:t>-</w:t>
+      </w:r>
+      <w:proofErr w:type="spellStart"/>
+      <w:r>
+        <w:rPr>
+          <w:color w:val="1A1A1A"/>
+        </w:rPr>
+        <w:t>eep</w:t>
+      </w:r>
+      <w:proofErr w:type="spellEnd"/>
+      <w:r>
+        <w:rPr>
+          <w:color w:val="1A1A1A"/>
+        </w:rPr>
+        <w:t>-strands-agent-chat</w:t>
       </w:r>
     </w:p>
     <w:p>
@@ -3495,13 +3595,41 @@
         </w:rPr>
         <w:t xml:space="preserve"> </w:t>
       </w:r>
+      <w:proofErr w:type="spellStart"/>
       <w:r>
         <w:rPr>
           <w:rStyle w:val="HTMLCode"/>
           <w:sz w:val="24"/>
           <w:szCs w:val="24"/>
         </w:rPr>
-        <w:t>mlu-eep-</w:t>
+        <w:t>mlu</w:t>
+      </w:r>
+      <w:proofErr w:type="spellEnd"/>
+      <w:r>
+        <w:rPr>
+          <w:rStyle w:val="HTMLCode"/>
+          <w:sz w:val="24"/>
+          <w:szCs w:val="24"/>
+        </w:rPr>
+        <w:t>-</w:t>
+      </w:r>
+      <w:proofErr w:type="spellStart"/>
+      <w:r>
+        <w:rPr>
+          <w:rStyle w:val="HTMLCode"/>
+          <w:sz w:val="24"/>
+          <w:szCs w:val="24"/>
+        </w:rPr>
+        <w:t>eep</w:t>
+      </w:r>
+      <w:proofErr w:type="spellEnd"/>
+      <w:r>
+        <w:rPr>
+          <w:rStyle w:val="HTMLCode"/>
+          <w:sz w:val="24"/>
+          <w:szCs w:val="24"/>
+        </w:rPr>
+        <w:t>-</w:t>
       </w:r>
       <w:r>
         <w:rPr>
@@ -3803,8 +3931,32 @@
         <w:rPr>
           <w:color w:val="1A1A1A"/>
         </w:rPr>
-        <w:t>python3 -m venv .venv</w:t>
-      </w:r>
+        <w:t xml:space="preserve">python3 -m </w:t>
+      </w:r>
+      <w:proofErr w:type="spellStart"/>
+      <w:proofErr w:type="gramStart"/>
+      <w:r>
+        <w:rPr>
+          <w:color w:val="1A1A1A"/>
+        </w:rPr>
+        <w:t>venv</w:t>
+      </w:r>
+      <w:proofErr w:type="spellEnd"/>
+      <w:r>
+        <w:rPr>
+          <w:color w:val="1A1A1A"/>
+        </w:rPr>
+        <w:t xml:space="preserve"> .</w:t>
+      </w:r>
+      <w:proofErr w:type="spellStart"/>
+      <w:r>
+        <w:rPr>
+          <w:color w:val="1A1A1A"/>
+        </w:rPr>
+        <w:t>venv</w:t>
+      </w:r>
+      <w:proofErr w:type="spellEnd"/>
+      <w:proofErr w:type="gramEnd"/>
     </w:p>
     <w:p>
       <w:pPr>
@@ -3813,11 +3965,27 @@
           <w:color w:val="1A1A1A"/>
         </w:rPr>
       </w:pPr>
-      <w:r>
-        <w:rPr>
-          <w:color w:val="1A1A1A"/>
-        </w:rPr>
-        <w:t>source .venv/bin/activate</w:t>
+      <w:proofErr w:type="gramStart"/>
+      <w:r>
+        <w:rPr>
+          <w:color w:val="1A1A1A"/>
+        </w:rPr>
+        <w:t>source .</w:t>
+      </w:r>
+      <w:proofErr w:type="spellStart"/>
+      <w:r>
+        <w:rPr>
+          <w:color w:val="1A1A1A"/>
+        </w:rPr>
+        <w:t>venv</w:t>
+      </w:r>
+      <w:proofErr w:type="spellEnd"/>
+      <w:proofErr w:type="gramEnd"/>
+      <w:r>
+        <w:rPr>
+          <w:color w:val="1A1A1A"/>
+        </w:rPr>
+        <w:t>/bin/activate</w:t>
       </w:r>
     </w:p>
     <w:p>
@@ -3847,11 +4015,27 @@
           <w:color w:val="1A1A1A"/>
         </w:rPr>
       </w:pPr>
-      <w:r>
-        <w:rPr>
-          <w:color w:val="1A1A1A"/>
-        </w:rPr>
-        <w:t>.venv\Scripts\activate</w:t>
+      <w:proofErr w:type="gramStart"/>
+      <w:r>
+        <w:rPr>
+          <w:color w:val="1A1A1A"/>
+        </w:rPr>
+        <w:t>.</w:t>
+      </w:r>
+      <w:proofErr w:type="spellStart"/>
+      <w:r>
+        <w:rPr>
+          <w:color w:val="1A1A1A"/>
+        </w:rPr>
+        <w:t>venv</w:t>
+      </w:r>
+      <w:proofErr w:type="spellEnd"/>
+      <w:proofErr w:type="gramEnd"/>
+      <w:r>
+        <w:rPr>
+          <w:color w:val="1A1A1A"/>
+        </w:rPr>
+        <w:t>\Scripts\activate</w:t>
       </w:r>
     </w:p>
     <w:p>
@@ -3881,7 +4065,29 @@
           <w:sz w:val="24"/>
           <w:szCs w:val="24"/>
         </w:rPr>
-        <w:t>(.venv)</w:t>
+        <w:t>(.</w:t>
+      </w:r>
+      <w:proofErr w:type="spellStart"/>
+      <w:r>
+        <w:rPr>
+          <w:rStyle w:val="HTMLCode"/>
+          <w:rFonts w:asciiTheme="minorHAnsi" w:hAnsiTheme="minorHAnsi"/>
+          <w:color w:val="1A1A1A"/>
+          <w:sz w:val="24"/>
+          <w:szCs w:val="24"/>
+        </w:rPr>
+        <w:t>venv</w:t>
+      </w:r>
+      <w:proofErr w:type="spellEnd"/>
+      <w:r>
+        <w:rPr>
+          <w:rStyle w:val="HTMLCode"/>
+          <w:rFonts w:asciiTheme="minorHAnsi" w:hAnsiTheme="minorHAnsi"/>
+          <w:color w:val="1A1A1A"/>
+          <w:sz w:val="24"/>
+          <w:szCs w:val="24"/>
+        </w:rPr>
+        <w:t>)</w:t>
       </w:r>
       <w:r>
         <w:rPr>
@@ -3925,15 +4131,9 @@
           <w:sz w:val="24"/>
           <w:szCs w:val="24"/>
         </w:rPr>
-        <w:t>(.venv)</w:t>
-      </w:r>
-      <w:r>
-        <w:rPr>
-          <w:rFonts w:asciiTheme="minorHAnsi" w:hAnsiTheme="minorHAnsi" w:cs="Calibri"/>
-          <w:color w:val="1A1A1A"/>
-        </w:rPr>
-        <w:t xml:space="preserve"> in your terminal prompt before continuing. Every time you open a new terminal in Kiro during this lab, you must re-activate the environment with </w:t>
-      </w:r>
+        <w:t>(.</w:t>
+      </w:r>
+      <w:proofErr w:type="spellStart"/>
       <w:r>
         <w:rPr>
           <w:rStyle w:val="HTMLCode"/>
@@ -3942,15 +4142,9 @@
           <w:sz w:val="24"/>
           <w:szCs w:val="24"/>
         </w:rPr>
-        <w:t>source .venv/bin/activate</w:t>
-      </w:r>
-      <w:r>
-        <w:rPr>
-          <w:rFonts w:asciiTheme="minorHAnsi" w:hAnsiTheme="minorHAnsi" w:cs="Calibri"/>
-          <w:color w:val="1A1A1A"/>
-        </w:rPr>
-        <w:t xml:space="preserve">. All </w:t>
-      </w:r>
+        <w:t>venv</w:t>
+      </w:r>
+      <w:proofErr w:type="spellEnd"/>
       <w:r>
         <w:rPr>
           <w:rStyle w:val="HTMLCode"/>
@@ -3959,15 +4153,16 @@
           <w:sz w:val="24"/>
           <w:szCs w:val="24"/>
         </w:rPr>
-        <w:t>pip install</w:t>
-      </w:r>
-      <w:r>
-        <w:rPr>
-          <w:rFonts w:asciiTheme="minorHAnsi" w:hAnsiTheme="minorHAnsi" w:cs="Calibri"/>
-          <w:color w:val="1A1A1A"/>
-        </w:rPr>
-        <w:t xml:space="preserve"> and </w:t>
-      </w:r>
+        <w:t>)</w:t>
+      </w:r>
+      <w:r>
+        <w:rPr>
+          <w:rFonts w:asciiTheme="minorHAnsi" w:hAnsiTheme="minorHAnsi" w:cs="Calibri"/>
+          <w:color w:val="1A1A1A"/>
+        </w:rPr>
+        <w:t xml:space="preserve"> in your terminal prompt before continuing. Every time you open a new terminal in Kiro during this lab, you must re-activate the environment with </w:t>
+      </w:r>
+      <w:proofErr w:type="gramStart"/>
       <w:r>
         <w:rPr>
           <w:rStyle w:val="HTMLCode"/>
@@ -3976,6 +4171,75 @@
           <w:sz w:val="24"/>
           <w:szCs w:val="24"/>
         </w:rPr>
+        <w:t>source .</w:t>
+      </w:r>
+      <w:proofErr w:type="spellStart"/>
+      <w:r>
+        <w:rPr>
+          <w:rStyle w:val="HTMLCode"/>
+          <w:rFonts w:asciiTheme="minorHAnsi" w:hAnsiTheme="minorHAnsi"/>
+          <w:color w:val="1A1A1A"/>
+          <w:sz w:val="24"/>
+          <w:szCs w:val="24"/>
+        </w:rPr>
+        <w:t>venv</w:t>
+      </w:r>
+      <w:proofErr w:type="spellEnd"/>
+      <w:proofErr w:type="gramEnd"/>
+      <w:r>
+        <w:rPr>
+          <w:rStyle w:val="HTMLCode"/>
+          <w:rFonts w:asciiTheme="minorHAnsi" w:hAnsiTheme="minorHAnsi"/>
+          <w:color w:val="1A1A1A"/>
+          <w:sz w:val="24"/>
+          <w:szCs w:val="24"/>
+        </w:rPr>
+        <w:t>/bin/activate</w:t>
+      </w:r>
+      <w:r>
+        <w:rPr>
+          <w:rFonts w:asciiTheme="minorHAnsi" w:hAnsiTheme="minorHAnsi" w:cs="Calibri"/>
+          <w:color w:val="1A1A1A"/>
+        </w:rPr>
+        <w:t xml:space="preserve">. All </w:t>
+      </w:r>
+      <w:r>
+        <w:rPr>
+          <w:rStyle w:val="HTMLCode"/>
+          <w:rFonts w:asciiTheme="minorHAnsi" w:hAnsiTheme="minorHAnsi"/>
+          <w:color w:val="1A1A1A"/>
+          <w:sz w:val="24"/>
+          <w:szCs w:val="24"/>
+        </w:rPr>
+        <w:t xml:space="preserve">pip </w:t>
+      </w:r>
+      <w:proofErr w:type="gramStart"/>
+      <w:r>
+        <w:rPr>
+          <w:rStyle w:val="HTMLCode"/>
+          <w:rFonts w:asciiTheme="minorHAnsi" w:hAnsiTheme="minorHAnsi"/>
+          <w:color w:val="1A1A1A"/>
+          <w:sz w:val="24"/>
+          <w:szCs w:val="24"/>
+        </w:rPr>
+        <w:t>install</w:t>
+      </w:r>
+      <w:proofErr w:type="gramEnd"/>
+      <w:r>
+        <w:rPr>
+          <w:rFonts w:asciiTheme="minorHAnsi" w:hAnsiTheme="minorHAnsi" w:cs="Calibri"/>
+          <w:color w:val="1A1A1A"/>
+        </w:rPr>
+        <w:t xml:space="preserve"> and </w:t>
+      </w:r>
+      <w:r>
+        <w:rPr>
+          <w:rStyle w:val="HTMLCode"/>
+          <w:rFonts w:asciiTheme="minorHAnsi" w:hAnsiTheme="minorHAnsi"/>
+          <w:color w:val="1A1A1A"/>
+          <w:sz w:val="24"/>
+          <w:szCs w:val="24"/>
+        </w:rPr>
         <w:t>python</w:t>
       </w:r>
       <w:r>
@@ -4084,7 +4348,21 @@
         <w:rPr>
           <w:color w:val="1A1A1A"/>
         </w:rPr>
-        <w:t>pip list | grep -E "strands|flask"</w:t>
+        <w:t>pip list | grep -E "</w:t>
+      </w:r>
+      <w:proofErr w:type="spellStart"/>
+      <w:r>
+        <w:rPr>
+          <w:color w:val="1A1A1A"/>
+        </w:rPr>
+        <w:t>strands|flask</w:t>
+      </w:r>
+      <w:proofErr w:type="spellEnd"/>
+      <w:r>
+        <w:rPr>
+          <w:color w:val="1A1A1A"/>
+        </w:rPr>
+        <w:t>"</w:t>
       </w:r>
     </w:p>
     <w:p>
@@ -4144,7 +4422,6 @@
         </w:rPr>
         <w:t xml:space="preserve">, and </w:t>
       </w:r>
-      <w:commentRangeStart w:id="0"/>
       <w:r>
         <w:rPr>
           <w:rStyle w:val="HTMLCode"/>
@@ -4155,17 +4432,6 @@
         </w:rPr>
         <w:t>flask</w:t>
       </w:r>
-      <w:commentRangeEnd w:id="0"/>
-      <w:r>
-        <w:rPr>
-          <w:rStyle w:val="CommentReference"/>
-          <w:rFonts w:asciiTheme="minorHAnsi" w:hAnsiTheme="minorHAnsi" w:cs="Calibri"/>
-          <w:color w:val="1A1A1A"/>
-          <w:sz w:val="24"/>
-          <w:szCs w:val="24"/>
-        </w:rPr>
-        <w:commentReference w:id="0"/>
-      </w:r>
       <w:r>
         <w:rPr>
           <w:rFonts w:asciiTheme="minorHAnsi" w:hAnsiTheme="minorHAnsi" w:cs="Calibri"/>
@@ -4217,11 +4483,33 @@
           <w:color w:val="1A1A1A"/>
         </w:rPr>
       </w:pPr>
-      <w:r>
-        <w:rPr>
-          <w:color w:val="1A1A1A"/>
-        </w:rPr>
-        <w:t>aws sts get-caller-identity</w:t>
+      <w:proofErr w:type="spellStart"/>
+      <w:r>
+        <w:rPr>
+          <w:color w:val="1A1A1A"/>
+        </w:rPr>
+        <w:t>aws</w:t>
+      </w:r>
+      <w:proofErr w:type="spellEnd"/>
+      <w:r>
+        <w:rPr>
+          <w:color w:val="1A1A1A"/>
+        </w:rPr>
+        <w:t xml:space="preserve"> </w:t>
+      </w:r>
+      <w:proofErr w:type="spellStart"/>
+      <w:r>
+        <w:rPr>
+          <w:color w:val="1A1A1A"/>
+        </w:rPr>
+        <w:t>sts</w:t>
+      </w:r>
+      <w:proofErr w:type="spellEnd"/>
+      <w:r>
+        <w:rPr>
+          <w:color w:val="1A1A1A"/>
+        </w:rPr>
+        <w:t xml:space="preserve"> get-caller-identity</w:t>
       </w:r>
     </w:p>
     <w:p>
@@ -4251,11 +4539,19 @@
           <w:color w:val="1A1A1A"/>
         </w:rPr>
       </w:pPr>
-      <w:r>
-        <w:rPr>
-          <w:color w:val="1A1A1A"/>
-        </w:rPr>
-        <w:t>aws configure</w:t>
+      <w:proofErr w:type="spellStart"/>
+      <w:r>
+        <w:rPr>
+          <w:color w:val="1A1A1A"/>
+        </w:rPr>
+        <w:t>aws</w:t>
+      </w:r>
+      <w:proofErr w:type="spellEnd"/>
+      <w:r>
+        <w:rPr>
+          <w:color w:val="1A1A1A"/>
+        </w:rPr>
+        <w:t xml:space="preserve"> configure</w:t>
       </w:r>
     </w:p>
     <w:p>
@@ -4294,8 +4590,16 @@
         <w:rPr>
           <w:color w:val="1A1A1A"/>
         </w:rPr>
-        <w:t>export AWS_ACCESS_KEY_ID=your_access_key</w:t>
-      </w:r>
+        <w:t>export AWS_ACCESS_KEY_ID=</w:t>
+      </w:r>
+      <w:proofErr w:type="spellStart"/>
+      <w:r>
+        <w:rPr>
+          <w:color w:val="1A1A1A"/>
+        </w:rPr>
+        <w:t>your_access_key</w:t>
+      </w:r>
+      <w:proofErr w:type="spellEnd"/>
     </w:p>
     <w:p>
       <w:pPr>
@@ -4308,8 +4612,16 @@
         <w:rPr>
           <w:color w:val="1A1A1A"/>
         </w:rPr>
-        <w:t>export AWS_SECRET_ACCESS_KEY=your_secret_key</w:t>
-      </w:r>
+        <w:t>export AWS_SECRET_ACCESS_KEY=</w:t>
+      </w:r>
+      <w:proofErr w:type="spellStart"/>
+      <w:r>
+        <w:rPr>
+          <w:color w:val="1A1A1A"/>
+        </w:rPr>
+        <w:t>your_secret_key</w:t>
+      </w:r>
+      <w:proofErr w:type="spellEnd"/>
     </w:p>
     <w:p>
       <w:pPr>
@@ -4322,8 +4634,16 @@
         <w:rPr>
           <w:color w:val="1A1A1A"/>
         </w:rPr>
-        <w:t>export AWS_SESSION_TOKEN=your_session_token</w:t>
-      </w:r>
+        <w:t>export AWS_SESSION_TOKEN=</w:t>
+      </w:r>
+      <w:proofErr w:type="spellStart"/>
+      <w:r>
+        <w:rPr>
+          <w:color w:val="1A1A1A"/>
+        </w:rPr>
+        <w:t>your_session_token</w:t>
+      </w:r>
+      <w:proofErr w:type="spellEnd"/>
     </w:p>
     <w:p>
       <w:pPr>
@@ -4771,7 +5091,7 @@
                     <pic:cNvPicPr/>
                   </pic:nvPicPr>
                   <pic:blipFill>
-                    <a:blip r:embed="rId14">
+                    <a:blip r:embed="rId10">
                       <a:extLst>
                         <a:ext uri="{28A0092B-C50C-407E-A947-70E740481C1C}">
                           <a14:useLocalDpi xmlns:a14="http://schemas.microsoft.com/office/drawing/2010/main" val="0"/>
@@ -4884,7 +5204,7 @@
                     <pic:cNvPicPr/>
                   </pic:nvPicPr>
                   <pic:blipFill>
-                    <a:blip r:embed="rId15" cstate="print">
+                    <a:blip r:embed="rId11" cstate="print">
                       <a:extLst>
                         <a:ext uri="{28A0092B-C50C-407E-A947-70E740481C1C}">
                           <a14:useLocalDpi xmlns:a14="http://schemas.microsoft.com/office/drawing/2010/main" val="0"/>
@@ -4970,19 +5290,6 @@
         </w:rPr>
         <w:t>Step 3: Enter the Prompt</w:t>
       </w:r>
-      <w:r>
-        <w:rPr>
-          <w:rFonts w:ascii="Calibri" w:eastAsia="Times New Roman" w:hAnsi="Calibri" w:cs="Calibri"/>
-        </w:rPr>
-        <w:t xml:space="preserve"> </w:t>
-      </w:r>
-      <w:r>
-        <w:rPr>
-          <w:rFonts w:ascii="Calibri" w:eastAsia="Times New Roman" w:hAnsi="Calibri" w:cs="Calibri"/>
-          <w:highlight w:val="yellow"/>
-        </w:rPr>
-        <w:t>TODO later: Create a steering doc for the prompt detail</w:t>
-      </w:r>
     </w:p>
     <w:p>
       <w:pPr>
@@ -5215,22 +5522,9 @@
           <w:iCs/>
           <w:color w:val="1A1A1A"/>
         </w:rPr>
-        <w:t>   - A custom search_papers tool that delegates to a specialized Paper Search Agent</w:t>
-      </w:r>
-      <w:r>
-        <w:rPr>
-          <w:rFonts w:ascii="Calibri" w:hAnsi="Calibri" w:cs="Calibri"/>
-          <w:color w:val="1A1A1A"/>
-        </w:rPr>
-        <w:br/>
-      </w:r>
-      <w:r>
-        <w:rPr>
-          <w:rFonts w:ascii="Calibri" w:hAnsi="Calibri" w:cs="Calibri"/>
-          <w:color w:val="1A1A1A"/>
-        </w:rPr>
-        <w:br/>
-      </w:r>
+        <w:t xml:space="preserve">   - A custom </w:t>
+      </w:r>
+      <w:proofErr w:type="spellStart"/>
       <w:r>
         <w:rPr>
           <w:rFonts w:ascii="Calibri" w:hAnsi="Calibri" w:cs="Calibri"/>
@@ -5238,22 +5532,9 @@
           <w:iCs/>
           <w:color w:val="1A1A1A"/>
         </w:rPr>
-        <w:t>3. A Paper Search Agent (sub-agent) that uses the http_request tool from strands-agents-tools to search for academic papers via the arXiv API and Semantic Scholar API.</w:t>
-      </w:r>
-      <w:r>
-        <w:rPr>
-          <w:rFonts w:ascii="Calibri" w:hAnsi="Calibri" w:cs="Calibri"/>
-          <w:color w:val="1A1A1A"/>
-        </w:rPr>
-        <w:br/>
-      </w:r>
-      <w:r>
-        <w:rPr>
-          <w:rFonts w:ascii="Calibri" w:hAnsi="Calibri" w:cs="Calibri"/>
-          <w:color w:val="1A1A1A"/>
-        </w:rPr>
-        <w:br/>
-      </w:r>
+        <w:t>search_papers</w:t>
+      </w:r>
+      <w:proofErr w:type="spellEnd"/>
       <w:r>
         <w:rPr>
           <w:rFonts w:ascii="Calibri" w:hAnsi="Calibri" w:cs="Calibri"/>
@@ -5261,7 +5542,14 @@
           <w:iCs/>
           <w:color w:val="1A1A1A"/>
         </w:rPr>
-        <w:t>4. A responsive single-page HTML/CSS/JS chat frontend (index.html) with:</w:t>
+        <w:t xml:space="preserve"> tool that delegates to a specialized Paper Search Agent</w:t>
+      </w:r>
+      <w:r>
+        <w:rPr>
+          <w:rFonts w:ascii="Calibri" w:hAnsi="Calibri" w:cs="Calibri"/>
+          <w:color w:val="1A1A1A"/>
+        </w:rPr>
+        <w:br/>
       </w:r>
       <w:r>
         <w:rPr>
@@ -5277,15 +5565,9 @@
           <w:iCs/>
           <w:color w:val="1A1A1A"/>
         </w:rPr>
-        <w:t>   - A clean chat bubble interface with user and agent messages</w:t>
-      </w:r>
-      <w:r>
-        <w:rPr>
-          <w:rFonts w:ascii="Calibri" w:hAnsi="Calibri" w:cs="Calibri"/>
-          <w:color w:val="1A1A1A"/>
-        </w:rPr>
-        <w:br/>
-      </w:r>
+        <w:t xml:space="preserve">3. A Paper Search Agent (sub-agent) that uses the </w:t>
+      </w:r>
+      <w:proofErr w:type="spellStart"/>
       <w:r>
         <w:rPr>
           <w:rFonts w:ascii="Calibri" w:hAnsi="Calibri" w:cs="Calibri"/>
@@ -5293,15 +5575,9 @@
           <w:iCs/>
           <w:color w:val="1A1A1A"/>
         </w:rPr>
-        <w:t>   - Real-time status indicators showing which agent is working (using SSE)</w:t>
-      </w:r>
-      <w:r>
-        <w:rPr>
-          <w:rFonts w:ascii="Calibri" w:hAnsi="Calibri" w:cs="Calibri"/>
-          <w:color w:val="1A1A1A"/>
-        </w:rPr>
-        <w:br/>
-      </w:r>
+        <w:t>http_request</w:t>
+      </w:r>
+      <w:proofErr w:type="spellEnd"/>
       <w:r>
         <w:rPr>
           <w:rFonts w:ascii="Calibri" w:hAnsi="Calibri" w:cs="Calibri"/>
@@ -5309,15 +5585,9 @@
           <w:iCs/>
           <w:color w:val="1A1A1A"/>
         </w:rPr>
-        <w:t>   - A reset button to clear the conversation</w:t>
-      </w:r>
-      <w:r>
-        <w:rPr>
-          <w:rFonts w:ascii="Calibri" w:hAnsi="Calibri" w:cs="Calibri"/>
-          <w:color w:val="1A1A1A"/>
-        </w:rPr>
-        <w:br/>
-      </w:r>
+        <w:t xml:space="preserve"> tool from strands-agents-tools to search for academic papers via the </w:t>
+      </w:r>
+      <w:proofErr w:type="spellStart"/>
       <w:r>
         <w:rPr>
           <w:rFonts w:ascii="Calibri" w:hAnsi="Calibri" w:cs="Calibri"/>
@@ -5325,22 +5595,9 @@
           <w:iCs/>
           <w:color w:val="1A1A1A"/>
         </w:rPr>
-        <w:t>   - Gradient background styling and modern UI</w:t>
-      </w:r>
-      <w:r>
-        <w:rPr>
-          <w:rFonts w:ascii="Calibri" w:hAnsi="Calibri" w:cs="Calibri"/>
-          <w:color w:val="1A1A1A"/>
-        </w:rPr>
-        <w:br/>
-      </w:r>
-      <w:r>
-        <w:rPr>
-          <w:rFonts w:ascii="Calibri" w:hAnsi="Calibri" w:cs="Calibri"/>
-          <w:color w:val="1A1A1A"/>
-        </w:rPr>
-        <w:br/>
-      </w:r>
+        <w:t>arXiv</w:t>
+      </w:r>
+      <w:proofErr w:type="spellEnd"/>
       <w:r>
         <w:rPr>
           <w:rFonts w:ascii="Calibri" w:hAnsi="Calibri" w:cs="Calibri"/>
@@ -5348,7 +5605,7 @@
           <w:iCs/>
           <w:color w:val="1A1A1A"/>
         </w:rPr>
-        <w:t>5. A standalone multi-turn conversation example script (agent.py) that demonstrates how the Strands agent maintains context across multiple conversation turns using the calculator tool.</w:t>
+        <w:t xml:space="preserve"> API and Semantic Scholar API.</w:t>
       </w:r>
       <w:r>
         <w:rPr>
@@ -5371,6 +5628,116 @@
           <w:iCs/>
           <w:color w:val="1A1A1A"/>
         </w:rPr>
+        <w:t>4. A responsive single-page HTML/CSS/JS chat frontend (index.html) with:</w:t>
+      </w:r>
+      <w:r>
+        <w:rPr>
+          <w:rFonts w:ascii="Calibri" w:hAnsi="Calibri" w:cs="Calibri"/>
+          <w:color w:val="1A1A1A"/>
+        </w:rPr>
+        <w:br/>
+      </w:r>
+      <w:r>
+        <w:rPr>
+          <w:rFonts w:ascii="Calibri" w:hAnsi="Calibri" w:cs="Calibri"/>
+          <w:i/>
+          <w:iCs/>
+          <w:color w:val="1A1A1A"/>
+        </w:rPr>
+        <w:t>   - A clean chat bubble interface with user and agent messages</w:t>
+      </w:r>
+      <w:r>
+        <w:rPr>
+          <w:rFonts w:ascii="Calibri" w:hAnsi="Calibri" w:cs="Calibri"/>
+          <w:color w:val="1A1A1A"/>
+        </w:rPr>
+        <w:br/>
+      </w:r>
+      <w:r>
+        <w:rPr>
+          <w:rFonts w:ascii="Calibri" w:hAnsi="Calibri" w:cs="Calibri"/>
+          <w:i/>
+          <w:iCs/>
+          <w:color w:val="1A1A1A"/>
+        </w:rPr>
+        <w:t>   - Real-time status indicators showing which agent is working (using SSE)</w:t>
+      </w:r>
+      <w:r>
+        <w:rPr>
+          <w:rFonts w:ascii="Calibri" w:hAnsi="Calibri" w:cs="Calibri"/>
+          <w:color w:val="1A1A1A"/>
+        </w:rPr>
+        <w:br/>
+      </w:r>
+      <w:r>
+        <w:rPr>
+          <w:rFonts w:ascii="Calibri" w:hAnsi="Calibri" w:cs="Calibri"/>
+          <w:i/>
+          <w:iCs/>
+          <w:color w:val="1A1A1A"/>
+        </w:rPr>
+        <w:t>   - A reset button to clear the conversation</w:t>
+      </w:r>
+      <w:r>
+        <w:rPr>
+          <w:rFonts w:ascii="Calibri" w:hAnsi="Calibri" w:cs="Calibri"/>
+          <w:color w:val="1A1A1A"/>
+        </w:rPr>
+        <w:br/>
+      </w:r>
+      <w:r>
+        <w:rPr>
+          <w:rFonts w:ascii="Calibri" w:hAnsi="Calibri" w:cs="Calibri"/>
+          <w:i/>
+          <w:iCs/>
+          <w:color w:val="1A1A1A"/>
+        </w:rPr>
+        <w:t>   - Gradient background styling and modern UI</w:t>
+      </w:r>
+      <w:r>
+        <w:rPr>
+          <w:rFonts w:ascii="Calibri" w:hAnsi="Calibri" w:cs="Calibri"/>
+          <w:color w:val="1A1A1A"/>
+        </w:rPr>
+        <w:br/>
+      </w:r>
+      <w:r>
+        <w:rPr>
+          <w:rFonts w:ascii="Calibri" w:hAnsi="Calibri" w:cs="Calibri"/>
+          <w:color w:val="1A1A1A"/>
+        </w:rPr>
+        <w:br/>
+      </w:r>
+      <w:r>
+        <w:rPr>
+          <w:rFonts w:ascii="Calibri" w:hAnsi="Calibri" w:cs="Calibri"/>
+          <w:i/>
+          <w:iCs/>
+          <w:color w:val="1A1A1A"/>
+        </w:rPr>
+        <w:t>5. A standalone multi-turn conversation example script (agent.py) that demonstrates how the Strands agent maintains context across multiple conversation turns using the calculator tool.</w:t>
+      </w:r>
+      <w:r>
+        <w:rPr>
+          <w:rFonts w:ascii="Calibri" w:hAnsi="Calibri" w:cs="Calibri"/>
+          <w:color w:val="1A1A1A"/>
+        </w:rPr>
+        <w:br/>
+      </w:r>
+      <w:r>
+        <w:rPr>
+          <w:rFonts w:ascii="Calibri" w:hAnsi="Calibri" w:cs="Calibri"/>
+          <w:color w:val="1A1A1A"/>
+        </w:rPr>
+        <w:br/>
+      </w:r>
+      <w:r>
+        <w:rPr>
+          <w:rFonts w:ascii="Calibri" w:hAnsi="Calibri" w:cs="Calibri"/>
+          <w:i/>
+          <w:iCs/>
+          <w:color w:val="1A1A1A"/>
+        </w:rPr>
         <w:t>Use strands-agents, strands-agents-tools, and flask as the Python dependencies. The main agent should use a thread-safe queue to push status updates to the SSE stream so the frontend can show real-time progress.</w:t>
       </w:r>
       <w:r>
@@ -5754,7 +6121,17 @@
           <w:sz w:val="24"/>
           <w:szCs w:val="24"/>
         </w:rPr>
-        <w:t xml:space="preserve"> file inside the </w:t>
+        <w:t xml:space="preserve"> file inside </w:t>
+      </w:r>
+      <w:proofErr w:type="gramStart"/>
+      <w:r>
+        <w:rPr>
+          <w:rFonts w:asciiTheme="minorHAnsi" w:hAnsiTheme="minorHAnsi" w:cs="Calibri"/>
+          <w:color w:val="1A1A1A"/>
+          <w:sz w:val="24"/>
+          <w:szCs w:val="24"/>
+        </w:rPr>
+        <w:t xml:space="preserve">the </w:t>
       </w:r>
       <w:r>
         <w:rPr>
@@ -5764,7 +6141,30 @@
           <w:sz w:val="24"/>
           <w:szCs w:val="24"/>
         </w:rPr>
-        <w:t>.kiro/specs/</w:t>
+        <w:t>.</w:t>
+      </w:r>
+      <w:proofErr w:type="spellStart"/>
+      <w:r>
+        <w:rPr>
+          <w:rStyle w:val="HTMLCode"/>
+          <w:rFonts w:asciiTheme="minorHAnsi" w:hAnsiTheme="minorHAnsi"/>
+          <w:color w:val="1A1A1A"/>
+          <w:sz w:val="24"/>
+          <w:szCs w:val="24"/>
+        </w:rPr>
+        <w:t>kiro</w:t>
+      </w:r>
+      <w:proofErr w:type="spellEnd"/>
+      <w:proofErr w:type="gramEnd"/>
+      <w:r>
+        <w:rPr>
+          <w:rStyle w:val="HTMLCode"/>
+          <w:rFonts w:asciiTheme="minorHAnsi" w:hAnsiTheme="minorHAnsi"/>
+          <w:color w:val="1A1A1A"/>
+          <w:sz w:val="24"/>
+          <w:szCs w:val="24"/>
+        </w:rPr>
+        <w:t>/specs/</w:t>
       </w:r>
       <w:r>
         <w:rPr>
@@ -6213,6 +6613,7 @@
         </w:rPr>
         <w:t xml:space="preserve"> Do not just click through the requirements. </w:t>
       </w:r>
+      <w:proofErr w:type="gramStart"/>
       <w:r>
         <w:rPr>
           <w:rFonts w:asciiTheme="minorHAnsi" w:hAnsiTheme="minorHAnsi" w:cs="Calibri"/>
@@ -6225,7 +6626,15 @@
           <w:rFonts w:asciiTheme="minorHAnsi" w:hAnsiTheme="minorHAnsi" w:cs="Calibri"/>
           <w:color w:val="1A1A1A"/>
         </w:rPr>
-        <w:t xml:space="preserve"> read them. This is your chance to catch misunderstandings early, before any code is written. It is much cheaper to fix a requirement than to rewrite code. </w:t>
+        <w:t xml:space="preserve"> read</w:t>
+      </w:r>
+      <w:proofErr w:type="gramEnd"/>
+      <w:r>
+        <w:rPr>
+          <w:rFonts w:asciiTheme="minorHAnsi" w:hAnsiTheme="minorHAnsi" w:cs="Calibri"/>
+          <w:color w:val="1A1A1A"/>
+        </w:rPr>
+        <w:t xml:space="preserve"> them. This is your chance to catch misunderstandings early, before any code is written. It is much cheaper to fix a requirement than to rewrite code. </w:t>
       </w:r>
     </w:p>
     <w:p>
@@ -6345,7 +6754,27 @@
           <w:iCs/>
           <w:color w:val="1A1A1A"/>
         </w:rPr>
-        <w:t>"The paper search should use only arXiv APIs"</w:t>
+        <w:t xml:space="preserve">"The paper search should use only </w:t>
+      </w:r>
+      <w:proofErr w:type="spellStart"/>
+      <w:r>
+        <w:rPr>
+          <w:rFonts w:asciiTheme="minorHAnsi" w:hAnsiTheme="minorHAnsi" w:cs="Calibri"/>
+          <w:i/>
+          <w:iCs/>
+          <w:color w:val="1A1A1A"/>
+        </w:rPr>
+        <w:t>arXiv</w:t>
+      </w:r>
+      <w:proofErr w:type="spellEnd"/>
+      <w:r>
+        <w:rPr>
+          <w:rFonts w:asciiTheme="minorHAnsi" w:hAnsiTheme="minorHAnsi" w:cs="Calibri"/>
+          <w:i/>
+          <w:iCs/>
+          <w:color w:val="1A1A1A"/>
+        </w:rPr>
+        <w:t xml:space="preserve"> APIs"</w:t>
       </w:r>
     </w:p>
     <w:p>
@@ -6447,7 +6876,15 @@
           <w:rFonts w:asciiTheme="minorHAnsi" w:hAnsiTheme="minorHAnsi" w:cs="Calibri"/>
           <w:color w:val="1A1A1A"/>
         </w:rPr>
-        <w:t xml:space="preserve"> At this point, you should have a </w:t>
+        <w:t xml:space="preserve"> At this point, you should have </w:t>
+      </w:r>
+      <w:proofErr w:type="gramStart"/>
+      <w:r>
+        <w:rPr>
+          <w:rFonts w:asciiTheme="minorHAnsi" w:hAnsiTheme="minorHAnsi" w:cs="Calibri"/>
+          <w:color w:val="1A1A1A"/>
+        </w:rPr>
+        <w:t xml:space="preserve">a </w:t>
       </w:r>
       <w:r>
         <w:rPr>
@@ -6457,14 +6894,53 @@
           <w:sz w:val="24"/>
           <w:szCs w:val="24"/>
         </w:rPr>
-        <w:t>.kiro/specs/</w:t>
-      </w:r>
-      <w:r>
-        <w:rPr>
-          <w:rFonts w:asciiTheme="minorHAnsi" w:hAnsiTheme="minorHAnsi" w:cs="Calibri"/>
-          <w:color w:val="1A1A1A"/>
-        </w:rPr>
-        <w:t xml:space="preserve"> folder in your project containing a requirements document. The requirements should cover: chat messaging, calculator tool, Python REPL tool, paper search delegation, SSE status streaming, reset functionality, and the standalone agent example.</w:t>
+        <w:t>.</w:t>
+      </w:r>
+      <w:proofErr w:type="spellStart"/>
+      <w:r>
+        <w:rPr>
+          <w:rStyle w:val="HTMLCode"/>
+          <w:rFonts w:asciiTheme="minorHAnsi" w:hAnsiTheme="minorHAnsi"/>
+          <w:color w:val="1A1A1A"/>
+          <w:sz w:val="24"/>
+          <w:szCs w:val="24"/>
+        </w:rPr>
+        <w:t>kiro</w:t>
+      </w:r>
+      <w:proofErr w:type="spellEnd"/>
+      <w:proofErr w:type="gramEnd"/>
+      <w:r>
+        <w:rPr>
+          <w:rStyle w:val="HTMLCode"/>
+          <w:rFonts w:asciiTheme="minorHAnsi" w:hAnsiTheme="minorHAnsi"/>
+          <w:color w:val="1A1A1A"/>
+          <w:sz w:val="24"/>
+          <w:szCs w:val="24"/>
+        </w:rPr>
+        <w:t>/specs/</w:t>
+      </w:r>
+      <w:r>
+        <w:rPr>
+          <w:rFonts w:asciiTheme="minorHAnsi" w:hAnsiTheme="minorHAnsi" w:cs="Calibri"/>
+          <w:color w:val="1A1A1A"/>
+        </w:rPr>
+        <w:t xml:space="preserve"> folder in your project containing a requirements document. The requirements should </w:t>
+      </w:r>
+      <w:proofErr w:type="gramStart"/>
+      <w:r>
+        <w:rPr>
+          <w:rFonts w:asciiTheme="minorHAnsi" w:hAnsiTheme="minorHAnsi" w:cs="Calibri"/>
+          <w:color w:val="1A1A1A"/>
+        </w:rPr>
+        <w:t>cover:</w:t>
+      </w:r>
+      <w:proofErr w:type="gramEnd"/>
+      <w:r>
+        <w:rPr>
+          <w:rFonts w:asciiTheme="minorHAnsi" w:hAnsiTheme="minorHAnsi" w:cs="Calibri"/>
+          <w:color w:val="1A1A1A"/>
+        </w:rPr>
+        <w:t xml:space="preserve"> chat messaging, calculator tool, Python REPL tool, paper search delegation, SSE status streaming, reset functionality, and the standalone agent example.</w:t>
       </w:r>
     </w:p>
     <w:p>
@@ -6770,7 +7246,27 @@
           <w:sz w:val="24"/>
           <w:szCs w:val="24"/>
         </w:rPr>
-        <w:t xml:space="preserve"> (the architecture may vary but should be similar to this</w:t>
+        <w:t xml:space="preserve"> (the architecture may vary but should be </w:t>
+      </w:r>
+      <w:proofErr w:type="gramStart"/>
+      <w:r>
+        <w:rPr>
+          <w:rFonts w:asciiTheme="minorHAnsi" w:hAnsiTheme="minorHAnsi" w:cs="Calibri"/>
+          <w:color w:val="1A1A1A"/>
+          <w:sz w:val="24"/>
+          <w:szCs w:val="24"/>
+        </w:rPr>
+        <w:t>similar to</w:t>
+      </w:r>
+      <w:proofErr w:type="gramEnd"/>
+      <w:r>
+        <w:rPr>
+          <w:rFonts w:asciiTheme="minorHAnsi" w:hAnsiTheme="minorHAnsi" w:cs="Calibri"/>
+          <w:color w:val="1A1A1A"/>
+          <w:sz w:val="24"/>
+          <w:szCs w:val="24"/>
+        </w:rPr>
+        <w:t xml:space="preserve"> this</w:t>
       </w:r>
       <w:r>
         <w:rPr>
@@ -6812,7 +7308,7 @@
                     <pic:cNvPicPr/>
                   </pic:nvPicPr>
                   <pic:blipFill>
-                    <a:blip r:embed="rId16" cstate="print">
+                    <a:blip r:embed="rId12" cstate="print">
                       <a:extLst>
                         <a:ext uri="{28A0092B-C50C-407E-A947-70E740481C1C}">
                           <a14:useLocalDpi xmlns:a14="http://schemas.microsoft.com/office/drawing/2010/main" val="0"/>
@@ -7347,7 +7843,47 @@
                 <w:sz w:val="20"/>
                 <w:szCs w:val="20"/>
               </w:rPr>
-              <w:t>Provides calculator, python_repl, and http_request out of the box</w:t>
+              <w:t xml:space="preserve">Provides calculator, </w:t>
+            </w:r>
+            <w:proofErr w:type="spellStart"/>
+            <w:r>
+              <w:rPr>
+                <w:rFonts w:asciiTheme="minorHAnsi" w:hAnsiTheme="minorHAnsi" w:cs="Calibri"/>
+                <w:color w:val="1A1A1A"/>
+                <w:sz w:val="20"/>
+                <w:szCs w:val="20"/>
+              </w:rPr>
+              <w:t>python_repl</w:t>
+            </w:r>
+            <w:proofErr w:type="spellEnd"/>
+            <w:r>
+              <w:rPr>
+                <w:rFonts w:asciiTheme="minorHAnsi" w:hAnsiTheme="minorHAnsi" w:cs="Calibri"/>
+                <w:color w:val="1A1A1A"/>
+                <w:sz w:val="20"/>
+                <w:szCs w:val="20"/>
+              </w:rPr>
+              <w:t xml:space="preserve">, and </w:t>
+            </w:r>
+            <w:proofErr w:type="spellStart"/>
+            <w:r>
+              <w:rPr>
+                <w:rFonts w:asciiTheme="minorHAnsi" w:hAnsiTheme="minorHAnsi" w:cs="Calibri"/>
+                <w:color w:val="1A1A1A"/>
+                <w:sz w:val="20"/>
+                <w:szCs w:val="20"/>
+              </w:rPr>
+              <w:t>http_request</w:t>
+            </w:r>
+            <w:proofErr w:type="spellEnd"/>
+            <w:r>
+              <w:rPr>
+                <w:rFonts w:asciiTheme="minorHAnsi" w:hAnsiTheme="minorHAnsi" w:cs="Calibri"/>
+                <w:color w:val="1A1A1A"/>
+                <w:sz w:val="20"/>
+                <w:szCs w:val="20"/>
+              </w:rPr>
+              <w:t xml:space="preserve"> out of the box</w:t>
             </w:r>
           </w:p>
         </w:tc>
@@ -7466,7 +8002,27 @@
                 <w:sz w:val="20"/>
                 <w:szCs w:val="20"/>
               </w:rPr>
-              <w:t>Simpler than WebSockets for one-way server-to-client streaming</w:t>
+              <w:t xml:space="preserve">Simpler than </w:t>
+            </w:r>
+            <w:proofErr w:type="spellStart"/>
+            <w:r>
+              <w:rPr>
+                <w:rFonts w:asciiTheme="minorHAnsi" w:hAnsiTheme="minorHAnsi" w:cs="Calibri"/>
+                <w:color w:val="1A1A1A"/>
+                <w:sz w:val="20"/>
+                <w:szCs w:val="20"/>
+              </w:rPr>
+              <w:t>WebSockets</w:t>
+            </w:r>
+            <w:proofErr w:type="spellEnd"/>
+            <w:r>
+              <w:rPr>
+                <w:rFonts w:asciiTheme="minorHAnsi" w:hAnsiTheme="minorHAnsi" w:cs="Calibri"/>
+                <w:color w:val="1A1A1A"/>
+                <w:sz w:val="20"/>
+                <w:szCs w:val="20"/>
+              </w:rPr>
+              <w:t xml:space="preserve"> for one-way server-to-client streaming</w:t>
             </w:r>
           </w:p>
         </w:tc>
@@ -8169,8 +8725,17 @@
                 <w:rStyle w:val="HTMLCode"/>
                 <w:color w:val="1A1A1A"/>
               </w:rPr>
-              <w:t>/chat</w:t>
+              <w:t>/</w:t>
             </w:r>
+            <w:proofErr w:type="gramStart"/>
+            <w:r>
+              <w:rPr>
+                <w:rStyle w:val="HTMLCode"/>
+                <w:color w:val="1A1A1A"/>
+              </w:rPr>
+              <w:t>chat</w:t>
+            </w:r>
+            <w:proofErr w:type="gramEnd"/>
           </w:p>
         </w:tc>
         <w:tc>
@@ -8321,8 +8886,17 @@
                 <w:rStyle w:val="HTMLCode"/>
                 <w:color w:val="1A1A1A"/>
               </w:rPr>
-              <w:t>/reset</w:t>
+              <w:t>/</w:t>
             </w:r>
+            <w:proofErr w:type="gramStart"/>
+            <w:r>
+              <w:rPr>
+                <w:rStyle w:val="HTMLCode"/>
+                <w:color w:val="1A1A1A"/>
+              </w:rPr>
+              <w:t>reset</w:t>
+            </w:r>
+            <w:proofErr w:type="gramEnd"/>
           </w:p>
         </w:tc>
         <w:tc>
@@ -8476,7 +9050,23 @@
                 <w:rStyle w:val="HTMLCode"/>
                 <w:color w:val="1A1A1A"/>
               </w:rPr>
-              <w:t>/status-stream</w:t>
+              <w:t>/</w:t>
+            </w:r>
+            <w:proofErr w:type="gramStart"/>
+            <w:r>
+              <w:rPr>
+                <w:rStyle w:val="HTMLCode"/>
+                <w:color w:val="1A1A1A"/>
+              </w:rPr>
+              <w:t>status</w:t>
+            </w:r>
+            <w:proofErr w:type="gramEnd"/>
+            <w:r>
+              <w:rPr>
+                <w:rStyle w:val="HTMLCode"/>
+                <w:color w:val="1A1A1A"/>
+              </w:rPr>
+              <w:t>-stream</w:t>
             </w:r>
           </w:p>
         </w:tc>
@@ -8770,7 +9360,15 @@
           <w:rFonts w:asciiTheme="minorHAnsi" w:hAnsiTheme="minorHAnsi" w:cs="Calibri"/>
           <w:color w:val="1A1A1A"/>
         </w:rPr>
-        <w:t xml:space="preserve"> Your </w:t>
+        <w:t xml:space="preserve"> </w:t>
+      </w:r>
+      <w:proofErr w:type="gramStart"/>
+      <w:r>
+        <w:rPr>
+          <w:rFonts w:asciiTheme="minorHAnsi" w:hAnsiTheme="minorHAnsi" w:cs="Calibri"/>
+          <w:color w:val="1A1A1A"/>
+        </w:rPr>
+        <w:t xml:space="preserve">Your </w:t>
       </w:r>
       <w:r>
         <w:rPr>
@@ -8780,7 +9378,30 @@
           <w:sz w:val="24"/>
           <w:szCs w:val="24"/>
         </w:rPr>
-        <w:t>.kiro/specs/</w:t>
+        <w:t>.</w:t>
+      </w:r>
+      <w:proofErr w:type="spellStart"/>
+      <w:r>
+        <w:rPr>
+          <w:rStyle w:val="HTMLCode"/>
+          <w:rFonts w:asciiTheme="minorHAnsi" w:hAnsiTheme="minorHAnsi"/>
+          <w:color w:val="1A1A1A"/>
+          <w:sz w:val="24"/>
+          <w:szCs w:val="24"/>
+        </w:rPr>
+        <w:t>kiro</w:t>
+      </w:r>
+      <w:proofErr w:type="spellEnd"/>
+      <w:proofErr w:type="gramEnd"/>
+      <w:r>
+        <w:rPr>
+          <w:rStyle w:val="HTMLCode"/>
+          <w:rFonts w:asciiTheme="minorHAnsi" w:hAnsiTheme="minorHAnsi"/>
+          <w:color w:val="1A1A1A"/>
+          <w:sz w:val="24"/>
+          <w:szCs w:val="24"/>
+        </w:rPr>
+        <w:t>/specs/</w:t>
       </w:r>
       <w:r>
         <w:rPr>
@@ -8962,7 +9583,23 @@
           <w:rFonts w:asciiTheme="minorHAnsi" w:hAnsiTheme="minorHAnsi" w:cs="Amazon Ember"/>
           <w:color w:val="000000"/>
         </w:rPr>
-        <w:t>A Main Agent equipped with calculator, Python REPL, and custom search_papers tools</w:t>
+        <w:t xml:space="preserve">A Main Agent equipped with calculator, Python REPL, and custom </w:t>
+      </w:r>
+      <w:proofErr w:type="spellStart"/>
+      <w:r>
+        <w:rPr>
+          <w:rFonts w:asciiTheme="minorHAnsi" w:hAnsiTheme="minorHAnsi" w:cs="Amazon Ember"/>
+          <w:color w:val="000000"/>
+        </w:rPr>
+        <w:t>search_papers</w:t>
+      </w:r>
+      <w:proofErr w:type="spellEnd"/>
+      <w:r>
+        <w:rPr>
+          <w:rFonts w:asciiTheme="minorHAnsi" w:hAnsiTheme="minorHAnsi" w:cs="Amazon Ember"/>
+          <w:color w:val="000000"/>
+        </w:rPr>
+        <w:t xml:space="preserve"> tools</w:t>
       </w:r>
     </w:p>
     <w:p>
@@ -8983,7 +9620,23 @@
           <w:rFonts w:asciiTheme="minorHAnsi" w:hAnsiTheme="minorHAnsi" w:cs="Amazon Ember"/>
           <w:color w:val="000000"/>
         </w:rPr>
-        <w:t>A transient Paper Search Agent (sub-agent) that queries arXiv and Semantic Scholar APIs</w:t>
+        <w:t xml:space="preserve">A transient Paper Search Agent (sub-agent) that queries </w:t>
+      </w:r>
+      <w:proofErr w:type="spellStart"/>
+      <w:r>
+        <w:rPr>
+          <w:rFonts w:asciiTheme="minorHAnsi" w:hAnsiTheme="minorHAnsi" w:cs="Amazon Ember"/>
+          <w:color w:val="000000"/>
+        </w:rPr>
+        <w:t>arXiv</w:t>
+      </w:r>
+      <w:proofErr w:type="spellEnd"/>
+      <w:r>
+        <w:rPr>
+          <w:rFonts w:asciiTheme="minorHAnsi" w:hAnsiTheme="minorHAnsi" w:cs="Amazon Ember"/>
+          <w:color w:val="000000"/>
+        </w:rPr>
+        <w:t xml:space="preserve"> and Semantic Scholar APIs</w:t>
       </w:r>
     </w:p>
     <w:p>
@@ -9716,7 +10369,38 @@
           <w:iCs/>
           <w:color w:val="1A1A1A"/>
         </w:rPr>
-        <w:t>"The SSE endpoint should use a 30-second timeout for the queue.get() call"</w:t>
+        <w:t xml:space="preserve">"The SSE endpoint should use a 30-second timeout for the </w:t>
+      </w:r>
+      <w:proofErr w:type="spellStart"/>
+      <w:proofErr w:type="gramStart"/>
+      <w:r>
+        <w:rPr>
+          <w:rFonts w:asciiTheme="minorHAnsi" w:hAnsiTheme="minorHAnsi" w:cs="Calibri"/>
+          <w:i/>
+          <w:iCs/>
+          <w:color w:val="1A1A1A"/>
+        </w:rPr>
+        <w:t>queue.get</w:t>
+      </w:r>
+      <w:proofErr w:type="spellEnd"/>
+      <w:r>
+        <w:rPr>
+          <w:rFonts w:asciiTheme="minorHAnsi" w:hAnsiTheme="minorHAnsi" w:cs="Calibri"/>
+          <w:i/>
+          <w:iCs/>
+          <w:color w:val="1A1A1A"/>
+        </w:rPr>
+        <w:t>(</w:t>
+      </w:r>
+      <w:proofErr w:type="gramEnd"/>
+      <w:r>
+        <w:rPr>
+          <w:rFonts w:asciiTheme="minorHAnsi" w:hAnsiTheme="minorHAnsi" w:cs="Calibri"/>
+          <w:i/>
+          <w:iCs/>
+          <w:color w:val="1A1A1A"/>
+        </w:rPr>
+        <w:t>) call"</w:t>
       </w:r>
     </w:p>
     <w:p>
@@ -9897,7 +10581,23 @@
           <w:rFonts w:asciiTheme="minorHAnsi" w:hAnsiTheme="minorHAnsi" w:cs="Calibri"/>
           <w:color w:val="1A1A1A"/>
         </w:rPr>
-        <w:t xml:space="preserve"> tasks are by default marked as optional by default by Kiro in order to speed up the </w:t>
+        <w:t xml:space="preserve"> tasks are by default marked as optional by default by Kiro </w:t>
+      </w:r>
+      <w:proofErr w:type="gramStart"/>
+      <w:r>
+        <w:rPr>
+          <w:rFonts w:asciiTheme="minorHAnsi" w:hAnsiTheme="minorHAnsi" w:cs="Calibri"/>
+          <w:color w:val="1A1A1A"/>
+        </w:rPr>
+        <w:t>in order to</w:t>
+      </w:r>
+      <w:proofErr w:type="gramEnd"/>
+      <w:r>
+        <w:rPr>
+          <w:rFonts w:asciiTheme="minorHAnsi" w:hAnsiTheme="minorHAnsi" w:cs="Calibri"/>
+          <w:color w:val="1A1A1A"/>
+        </w:rPr>
+        <w:t xml:space="preserve"> speed up the </w:t>
       </w:r>
       <w:r>
         <w:rPr>
@@ -9925,7 +10625,23 @@
           <w:rFonts w:asciiTheme="minorHAnsi" w:hAnsiTheme="minorHAnsi" w:cs="Calibri"/>
           <w:color w:val="1A1A1A"/>
         </w:rPr>
-        <w:t>light gray similer to the figure below:</w:t>
+        <w:t xml:space="preserve">light gray </w:t>
+      </w:r>
+      <w:proofErr w:type="spellStart"/>
+      <w:r>
+        <w:rPr>
+          <w:rFonts w:asciiTheme="minorHAnsi" w:hAnsiTheme="minorHAnsi" w:cs="Calibri"/>
+          <w:color w:val="1A1A1A"/>
+        </w:rPr>
+        <w:t>similer</w:t>
+      </w:r>
+      <w:proofErr w:type="spellEnd"/>
+      <w:r>
+        <w:rPr>
+          <w:rFonts w:asciiTheme="minorHAnsi" w:hAnsiTheme="minorHAnsi" w:cs="Calibri"/>
+          <w:color w:val="1A1A1A"/>
+        </w:rPr>
+        <w:t xml:space="preserve"> to the figure below:</w:t>
       </w:r>
     </w:p>
     <w:p>
@@ -9958,7 +10674,7 @@
                     <pic:cNvPicPr/>
                   </pic:nvPicPr>
                   <pic:blipFill>
-                    <a:blip r:embed="rId17">
+                    <a:blip r:embed="rId13">
                       <a:extLst>
                         <a:ext uri="{28A0092B-C50C-407E-A947-70E740481C1C}">
                           <a14:useLocalDpi xmlns:a14="http://schemas.microsoft.com/office/drawing/2010/main" val="0"/>
@@ -10026,7 +10742,23 @@
           <w:rFonts w:asciiTheme="minorHAnsi" w:hAnsiTheme="minorHAnsi" w:cs="Calibri"/>
           <w:color w:val="1A1A1A"/>
         </w:rPr>
-        <w:t>task required” or by removing the asterisk befor the name of the task in the tasks.md file.</w:t>
+        <w:t xml:space="preserve">task required” or by removing the asterisk </w:t>
+      </w:r>
+      <w:proofErr w:type="spellStart"/>
+      <w:r>
+        <w:rPr>
+          <w:rFonts w:asciiTheme="minorHAnsi" w:hAnsiTheme="minorHAnsi" w:cs="Calibri"/>
+          <w:color w:val="1A1A1A"/>
+        </w:rPr>
+        <w:t>befor</w:t>
+      </w:r>
+      <w:proofErr w:type="spellEnd"/>
+      <w:r>
+        <w:rPr>
+          <w:rFonts w:asciiTheme="minorHAnsi" w:hAnsiTheme="minorHAnsi" w:cs="Calibri"/>
+          <w:color w:val="1A1A1A"/>
+        </w:rPr>
+        <w:t xml:space="preserve"> the name of the task in the tasks.md file.</w:t>
       </w:r>
     </w:p>
     <w:p>
@@ -10122,7 +10854,15 @@
           <w:rFonts w:asciiTheme="minorHAnsi" w:hAnsiTheme="minorHAnsi" w:cs="Calibri"/>
           <w:color w:val="1A1A1A"/>
         </w:rPr>
-        <w:t xml:space="preserve">. The </w:t>
+        <w:t xml:space="preserve">. </w:t>
+      </w:r>
+      <w:proofErr w:type="gramStart"/>
+      <w:r>
+        <w:rPr>
+          <w:rFonts w:asciiTheme="minorHAnsi" w:hAnsiTheme="minorHAnsi" w:cs="Calibri"/>
+          <w:color w:val="1A1A1A"/>
+        </w:rPr>
+        <w:t xml:space="preserve">The </w:t>
       </w:r>
       <w:r>
         <w:rPr>
@@ -10132,7 +10872,30 @@
           <w:sz w:val="24"/>
           <w:szCs w:val="24"/>
         </w:rPr>
-        <w:t>.kiro/specs/</w:t>
+        <w:t>.</w:t>
+      </w:r>
+      <w:proofErr w:type="spellStart"/>
+      <w:r>
+        <w:rPr>
+          <w:rStyle w:val="HTMLCode"/>
+          <w:rFonts w:asciiTheme="minorHAnsi" w:hAnsiTheme="minorHAnsi"/>
+          <w:color w:val="1A1A1A"/>
+          <w:sz w:val="24"/>
+          <w:szCs w:val="24"/>
+        </w:rPr>
+        <w:t>kiro</w:t>
+      </w:r>
+      <w:proofErr w:type="spellEnd"/>
+      <w:proofErr w:type="gramEnd"/>
+      <w:r>
+        <w:rPr>
+          <w:rStyle w:val="HTMLCode"/>
+          <w:rFonts w:asciiTheme="minorHAnsi" w:hAnsiTheme="minorHAnsi"/>
+          <w:color w:val="1A1A1A"/>
+          <w:sz w:val="24"/>
+          <w:szCs w:val="24"/>
+        </w:rPr>
+        <w:t>/specs/</w:t>
       </w:r>
       <w:r>
         <w:rPr>
@@ -10218,7 +10981,29 @@
           <w:sz w:val="24"/>
           <w:szCs w:val="24"/>
         </w:rPr>
-        <w:t>(.venv)</w:t>
+        <w:t>(.</w:t>
+      </w:r>
+      <w:proofErr w:type="spellStart"/>
+      <w:r>
+        <w:rPr>
+          <w:rStyle w:val="HTMLCode"/>
+          <w:rFonts w:asciiTheme="minorHAnsi" w:hAnsiTheme="minorHAnsi"/>
+          <w:color w:val="1A1A1A"/>
+          <w:sz w:val="24"/>
+          <w:szCs w:val="24"/>
+        </w:rPr>
+        <w:t>venv</w:t>
+      </w:r>
+      <w:proofErr w:type="spellEnd"/>
+      <w:r>
+        <w:rPr>
+          <w:rStyle w:val="HTMLCode"/>
+          <w:rFonts w:asciiTheme="minorHAnsi" w:hAnsiTheme="minorHAnsi"/>
+          <w:color w:val="1A1A1A"/>
+          <w:sz w:val="24"/>
+          <w:szCs w:val="24"/>
+        </w:rPr>
+        <w:t>)</w:t>
       </w:r>
       <w:r>
         <w:rPr>
@@ -10237,11 +11022,27 @@
           <w:color w:val="1A1A1A"/>
         </w:rPr>
       </w:pPr>
-      <w:r>
-        <w:rPr>
-          <w:color w:val="1A1A1A"/>
-        </w:rPr>
-        <w:t>source .venv/bin/activate</w:t>
+      <w:proofErr w:type="gramStart"/>
+      <w:r>
+        <w:rPr>
+          <w:color w:val="1A1A1A"/>
+        </w:rPr>
+        <w:t>source .</w:t>
+      </w:r>
+      <w:proofErr w:type="spellStart"/>
+      <w:r>
+        <w:rPr>
+          <w:color w:val="1A1A1A"/>
+        </w:rPr>
+        <w:t>venv</w:t>
+      </w:r>
+      <w:proofErr w:type="spellEnd"/>
+      <w:proofErr w:type="gramEnd"/>
+      <w:r>
+        <w:rPr>
+          <w:color w:val="1A1A1A"/>
+        </w:rPr>
+        <w:t>/bin/activate</w:t>
       </w:r>
     </w:p>
     <w:p>
@@ -10265,11 +11066,33 @@
           <w:color w:val="1A1A1A"/>
         </w:rPr>
       </w:pPr>
-      <w:r>
-        <w:rPr>
-          <w:color w:val="1A1A1A"/>
-        </w:rPr>
-        <w:t>aws sts get-caller-identity</w:t>
+      <w:proofErr w:type="spellStart"/>
+      <w:r>
+        <w:rPr>
+          <w:color w:val="1A1A1A"/>
+        </w:rPr>
+        <w:t>aws</w:t>
+      </w:r>
+      <w:proofErr w:type="spellEnd"/>
+      <w:r>
+        <w:rPr>
+          <w:color w:val="1A1A1A"/>
+        </w:rPr>
+        <w:t xml:space="preserve"> </w:t>
+      </w:r>
+      <w:proofErr w:type="spellStart"/>
+      <w:r>
+        <w:rPr>
+          <w:color w:val="1A1A1A"/>
+        </w:rPr>
+        <w:t>sts</w:t>
+      </w:r>
+      <w:proofErr w:type="spellEnd"/>
+      <w:r>
+        <w:rPr>
+          <w:color w:val="1A1A1A"/>
+        </w:rPr>
+        <w:t xml:space="preserve"> get-caller-identity</w:t>
       </w:r>
     </w:p>
     <w:p>
@@ -10521,14 +11344,25 @@
         </w:rPr>
         <w:t xml:space="preserve">5000 </w:t>
       </w:r>
-      <w:r>
-        <w:rPr>
-          <w:rFonts w:asciiTheme="minorHAnsi" w:hAnsiTheme="minorHAnsi" w:cs="Calibri"/>
-          <w:color w:val="1A1A1A"/>
-          <w:sz w:val="24"/>
-          <w:szCs w:val="24"/>
-        </w:rPr>
-        <w:t xml:space="preserve">port </w:t>
+      <w:proofErr w:type="gramStart"/>
+      <w:r>
+        <w:rPr>
+          <w:rFonts w:asciiTheme="minorHAnsi" w:hAnsiTheme="minorHAnsi" w:cs="Calibri"/>
+          <w:color w:val="1A1A1A"/>
+          <w:sz w:val="24"/>
+          <w:szCs w:val="24"/>
+        </w:rPr>
+        <w:t>port</w:t>
+      </w:r>
+      <w:proofErr w:type="gramEnd"/>
+      <w:r>
+        <w:rPr>
+          <w:rFonts w:asciiTheme="minorHAnsi" w:hAnsiTheme="minorHAnsi" w:cs="Calibri"/>
+          <w:color w:val="1A1A1A"/>
+          <w:sz w:val="24"/>
+          <w:szCs w:val="24"/>
+        </w:rPr>
+        <w:t xml:space="preserve"> </w:t>
       </w:r>
       <w:r>
         <w:rPr>
@@ -12528,6 +13362,7 @@
         </w:rPr>
         <w:t xml:space="preserve">Explain the code of the </w:t>
       </w:r>
+      <w:proofErr w:type="spellStart"/>
       <w:r>
         <w:rPr>
           <w:rStyle w:val="HTMLCode"/>
@@ -12539,6 +13374,7 @@
         </w:rPr>
         <w:t>search_papers</w:t>
       </w:r>
+      <w:proofErr w:type="spellEnd"/>
       <w:r>
         <w:rPr>
           <w:rFonts w:asciiTheme="minorHAnsi" w:hAnsiTheme="minorHAnsi" w:cs="Calibri"/>
@@ -12700,6 +13536,7 @@
         </w:rPr>
         <w:t xml:space="preserve">Inside, it calls the </w:t>
       </w:r>
+      <w:proofErr w:type="spellStart"/>
       <w:r>
         <w:rPr>
           <w:rStyle w:val="HTMLCode"/>
@@ -12710,12 +13547,29 @@
         </w:rPr>
         <w:t>paper_search_agent</w:t>
       </w:r>
-      <w:r>
-        <w:rPr>
-          <w:rFonts w:asciiTheme="minorHAnsi" w:hAnsiTheme="minorHAnsi" w:cs="Calibri"/>
-          <w:color w:val="1A1A1A"/>
-        </w:rPr>
-        <w:t xml:space="preserve"> directly, which is a completely separate Agent instance</w:t>
+      <w:proofErr w:type="spellEnd"/>
+      <w:r>
+        <w:rPr>
+          <w:rFonts w:asciiTheme="minorHAnsi" w:hAnsiTheme="minorHAnsi" w:cs="Calibri"/>
+          <w:color w:val="1A1A1A"/>
+        </w:rPr>
+        <w:t xml:space="preserve"> directly, which is </w:t>
+      </w:r>
+      <w:proofErr w:type="gramStart"/>
+      <w:r>
+        <w:rPr>
+          <w:rFonts w:asciiTheme="minorHAnsi" w:hAnsiTheme="minorHAnsi" w:cs="Calibri"/>
+          <w:color w:val="1A1A1A"/>
+        </w:rPr>
+        <w:t>a completely separate</w:t>
+      </w:r>
+      <w:proofErr w:type="gramEnd"/>
+      <w:r>
+        <w:rPr>
+          <w:rFonts w:asciiTheme="minorHAnsi" w:hAnsiTheme="minorHAnsi" w:cs="Calibri"/>
+          <w:color w:val="1A1A1A"/>
+        </w:rPr>
+        <w:t xml:space="preserve"> Agent instance</w:t>
       </w:r>
     </w:p>
     <w:p>
@@ -13368,6 +14222,7 @@
                 <w:szCs w:val="20"/>
               </w:rPr>
             </w:pPr>
+            <w:proofErr w:type="spellStart"/>
             <w:r>
               <w:rPr>
                 <w:rFonts w:asciiTheme="minorHAnsi" w:hAnsiTheme="minorHAnsi" w:cs="Calibri"/>
@@ -13377,7 +14232,19 @@
                 <w:sz w:val="20"/>
                 <w:szCs w:val="20"/>
               </w:rPr>
-              <w:t>PyPI Name</w:t>
+              <w:t>PyPI</w:t>
+            </w:r>
+            <w:proofErr w:type="spellEnd"/>
+            <w:r>
+              <w:rPr>
+                <w:rFonts w:asciiTheme="minorHAnsi" w:hAnsiTheme="minorHAnsi" w:cs="Calibri"/>
+                <w:b/>
+                <w:bCs/>
+                <w:color w:val="FFFFFF"/>
+                <w:sz w:val="20"/>
+                <w:szCs w:val="20"/>
+              </w:rPr>
+              <w:t xml:space="preserve"> Name</w:t>
             </w:r>
           </w:p>
         </w:tc>
@@ -13704,6 +14571,7 @@
               </w:rPr>
               <w:t xml:space="preserve">, </w:t>
             </w:r>
+            <w:proofErr w:type="spellStart"/>
             <w:r>
               <w:rPr>
                 <w:rStyle w:val="HTMLCode"/>
@@ -13712,6 +14580,7 @@
               </w:rPr>
               <w:t>python_repl</w:t>
             </w:r>
+            <w:proofErr w:type="spellEnd"/>
             <w:r>
               <w:rPr>
                 <w:rFonts w:asciiTheme="minorHAnsi" w:hAnsiTheme="minorHAnsi" w:cs="Calibri"/>
@@ -13721,6 +14590,7 @@
               </w:rPr>
               <w:t xml:space="preserve">, </w:t>
             </w:r>
+            <w:proofErr w:type="spellStart"/>
             <w:r>
               <w:rPr>
                 <w:rStyle w:val="HTMLCode"/>
@@ -13729,6 +14599,7 @@
               </w:rPr>
               <w:t>http_request</w:t>
             </w:r>
+            <w:proofErr w:type="spellEnd"/>
           </w:p>
         </w:tc>
       </w:tr>
@@ -14086,6 +14957,7 @@
                 <w:szCs w:val="20"/>
               </w:rPr>
             </w:pPr>
+            <w:proofErr w:type="spellStart"/>
             <w:r>
               <w:rPr>
                 <w:rFonts w:asciiTheme="minorHAnsi" w:hAnsiTheme="minorHAnsi" w:cs="Calibri"/>
@@ -14093,7 +14965,17 @@
                 <w:sz w:val="20"/>
                 <w:szCs w:val="20"/>
               </w:rPr>
-              <w:t>arXiv API</w:t>
+              <w:t>arXiv</w:t>
+            </w:r>
+            <w:proofErr w:type="spellEnd"/>
+            <w:r>
+              <w:rPr>
+                <w:rFonts w:asciiTheme="minorHAnsi" w:hAnsiTheme="minorHAnsi" w:cs="Calibri"/>
+                <w:color w:val="1A1A1A"/>
+                <w:sz w:val="20"/>
+                <w:szCs w:val="20"/>
+              </w:rPr>
+              <w:t xml:space="preserve"> API</w:t>
             </w:r>
           </w:p>
         </w:tc>
@@ -14170,7 +15052,27 @@
                 <w:sz w:val="20"/>
                 <w:szCs w:val="20"/>
               </w:rPr>
-              <w:t>Search for academic papers on arXiv (open access preprint repository)</w:t>
+              <w:t xml:space="preserve">Search for academic papers on </w:t>
+            </w:r>
+            <w:proofErr w:type="spellStart"/>
+            <w:r>
+              <w:rPr>
+                <w:rFonts w:asciiTheme="minorHAnsi" w:hAnsiTheme="minorHAnsi" w:cs="Calibri"/>
+                <w:color w:val="1A1A1A"/>
+                <w:sz w:val="20"/>
+                <w:szCs w:val="20"/>
+              </w:rPr>
+              <w:t>arXiv</w:t>
+            </w:r>
+            <w:proofErr w:type="spellEnd"/>
+            <w:r>
+              <w:rPr>
+                <w:rFonts w:asciiTheme="minorHAnsi" w:hAnsiTheme="minorHAnsi" w:cs="Calibri"/>
+                <w:color w:val="1A1A1A"/>
+                <w:sz w:val="20"/>
+                <w:szCs w:val="20"/>
+              </w:rPr>
+              <w:t xml:space="preserve"> (open access preprint repository)</w:t>
             </w:r>
           </w:p>
         </w:tc>
@@ -14569,12 +15471,21 @@
                 <w:szCs w:val="20"/>
               </w:rPr>
             </w:pPr>
+            <w:proofErr w:type="spellStart"/>
             <w:r>
               <w:rPr>
                 <w:rStyle w:val="HTMLCode"/>
                 <w:color w:val="1A1A1A"/>
               </w:rPr>
-              <w:t>ModuleNotFoundError: No module named 'strands'</w:t>
+              <w:t>ModuleNotFoundError</w:t>
+            </w:r>
+            <w:proofErr w:type="spellEnd"/>
+            <w:r>
+              <w:rPr>
+                <w:rStyle w:val="HTMLCode"/>
+                <w:color w:val="1A1A1A"/>
+              </w:rPr>
+              <w:t>: No module named 'strands'</w:t>
             </w:r>
           </w:p>
         </w:tc>
@@ -14696,13 +15607,24 @@
                 <w:szCs w:val="20"/>
               </w:rPr>
             </w:pPr>
+            <w:proofErr w:type="spellStart"/>
+            <w:proofErr w:type="gramStart"/>
             <w:r>
               <w:rPr>
                 <w:rStyle w:val="HTMLCode"/>
                 <w:color w:val="1A1A1A"/>
               </w:rPr>
-              <w:t>botocore.exceptions.NoCredentialsError</w:t>
+              <w:t>botocore.exceptions</w:t>
             </w:r>
+            <w:proofErr w:type="gramEnd"/>
+            <w:r>
+              <w:rPr>
+                <w:rStyle w:val="HTMLCode"/>
+                <w:color w:val="1A1A1A"/>
+              </w:rPr>
+              <w:t>.NoCredentialsError</w:t>
+            </w:r>
+            <w:proofErr w:type="spellEnd"/>
           </w:p>
         </w:tc>
         <w:tc>
@@ -14781,12 +15703,21 @@
               </w:rPr>
               <w:t xml:space="preserve">Run </w:t>
             </w:r>
+            <w:proofErr w:type="spellStart"/>
             <w:r>
               <w:rPr>
                 <w:rStyle w:val="HTMLCode"/>
                 <w:color w:val="1A1A1A"/>
               </w:rPr>
-              <w:t>aws configure</w:t>
+              <w:t>aws</w:t>
+            </w:r>
+            <w:proofErr w:type="spellEnd"/>
+            <w:r>
+              <w:rPr>
+                <w:rStyle w:val="HTMLCode"/>
+                <w:color w:val="1A1A1A"/>
+              </w:rPr>
+              <w:t xml:space="preserve"> configure</w:t>
             </w:r>
             <w:r>
               <w:rPr>
@@ -14829,6 +15760,7 @@
                 <w:szCs w:val="20"/>
               </w:rPr>
             </w:pPr>
+            <w:proofErr w:type="spellStart"/>
             <w:r>
               <w:rPr>
                 <w:rStyle w:val="HTMLCode"/>
@@ -14836,6 +15768,7 @@
               </w:rPr>
               <w:t>AccessDeniedException</w:t>
             </w:r>
+            <w:proofErr w:type="spellEnd"/>
             <w:r>
               <w:rPr>
                 <w:rFonts w:ascii="Calibri" w:hAnsi="Calibri" w:cs="Calibri"/>
@@ -15698,6 +16631,7 @@
           <w:color w:val="1A1A1A"/>
         </w:rPr>
       </w:pPr>
+      <w:proofErr w:type="gramStart"/>
       <w:r>
         <w:rPr>
           <w:rFonts w:asciiTheme="minorHAnsi" w:hAnsiTheme="minorHAnsi" w:cs="Calibri"/>
@@ -15705,7 +16639,17 @@
           <w:bCs/>
           <w:color w:val="1A1A1A"/>
         </w:rPr>
-        <w:t>Actually read the requirements</w:t>
+        <w:t>Actually</w:t>
+      </w:r>
+      <w:proofErr w:type="gramEnd"/>
+      <w:r>
+        <w:rPr>
+          <w:rFonts w:asciiTheme="minorHAnsi" w:hAnsiTheme="minorHAnsi" w:cs="Calibri"/>
+          <w:b/>
+          <w:bCs/>
+          <w:color w:val="1A1A1A"/>
+        </w:rPr>
+        <w:t xml:space="preserve"> read the requirements</w:t>
       </w:r>
       <w:r>
         <w:rPr>
@@ -15802,7 +16746,23 @@
           <w:rFonts w:asciiTheme="minorHAnsi" w:hAnsiTheme="minorHAnsi" w:cs="Calibri"/>
           <w:color w:val="1A1A1A"/>
         </w:rPr>
-        <w:t xml:space="preserve"> - Kiro generates good code, but always review it. Check for edge cases, error handling, and security considerations.</w:t>
+        <w:t xml:space="preserve"> - Kiro generates good </w:t>
+      </w:r>
+      <w:proofErr w:type="gramStart"/>
+      <w:r>
+        <w:rPr>
+          <w:rFonts w:asciiTheme="minorHAnsi" w:hAnsiTheme="minorHAnsi" w:cs="Calibri"/>
+          <w:color w:val="1A1A1A"/>
+        </w:rPr>
+        <w:t>code, but</w:t>
+      </w:r>
+      <w:proofErr w:type="gramEnd"/>
+      <w:r>
+        <w:rPr>
+          <w:rFonts w:asciiTheme="minorHAnsi" w:hAnsiTheme="minorHAnsi" w:cs="Calibri"/>
+          <w:color w:val="1A1A1A"/>
+        </w:rPr>
+        <w:t xml:space="preserve"> always review it. Check for edge cases, error handling, and security considerations.</w:t>
       </w:r>
     </w:p>
     <w:p>
@@ -16862,46 +17822,6 @@
     </w:sectPr>
   </w:body>
 </w:document>
-</file>
-
-<file path=word/comments.xml><?xml version="1.0" encoding="utf-8"?>
-<w:comments xmlns:wpc="http://schemas.microsoft.com/office/word/2010/wordprocessingCanvas" xmlns:cx="http://schemas.microsoft.com/office/drawing/2014/chartex" xmlns:cx1="http://schemas.microsoft.com/office/drawing/2015/9/8/chartex" xmlns:cx2="http://schemas.microsoft.com/office/drawing/2015/10/21/chartex" xmlns:cx3="http://schemas.microsoft.com/office/drawing/2016/5/9/chartex" xmlns:cx4="http://schemas.microsoft.com/office/drawing/2016/5/10/chartex" xmlns:cx5="http://schemas.microsoft.com/office/drawing/2016/5/11/chartex" xmlns:cx6="http://schemas.microsoft.com/office/drawing/2016/5/12/chartex" xmlns:cx7="http://schemas.microsoft.com/office/drawing/2016/5/13/chartex" xmlns:cx8="http://schemas.microsoft.com/office/drawing/2016/5/14/chartex" xmlns:mc="http://schemas.openxmlformats.org/markup-compatibility/2006" xmlns:aink="http://schemas.microsoft.com/office/drawing/2016/ink" xmlns:am3d="http://schemas.microsoft.com/office/drawing/2017/model3d" xmlns:o="urn:schemas-microsoft-com:office:office" xmlns:oel="http://schemas.microsoft.com/office/2019/extlst" xmlns:r="http://schemas.openxmlformats.org/officeDocument/2006/relationships" xmlns:m="http://schemas.openxmlformats.org/officeDocument/2006/math" xmlns:v="urn:schemas-microsoft-com:vml" xmlns:wp14="http://schemas.microsoft.com/office/word/2010/wordprocessingDrawing" xmlns:wp="http://schemas.openxmlformats.org/drawingml/2006/wordprocessingDrawing" xmlns:w10="urn:schemas-microsoft-com:office:word" xmlns:w="http://schemas.openxmlformats.org/wordprocessingml/2006/main" xmlns:w14="http://schemas.microsoft.com/office/word/2010/wordml" xmlns:w15="http://schemas.microsoft.com/office/word/2012/wordml" xmlns:w16cex="http://schemas.microsoft.com/office/word/2018/wordml/cex" xmlns:w16cid="http://schemas.microsoft.com/office/word/2016/wordml/cid" xmlns:w16="http://schemas.microsoft.com/office/word/2018/wordml" xmlns:w16du="http://schemas.microsoft.com/office/word/2023/wordml/word16du" xmlns:w16sdtdh="http://schemas.microsoft.com/office/word/2020/wordml/sdtdatahash" xmlns:w16sdtfl="http://schemas.microsoft.com/office/word/2024/wordml/sdtformatlock" xmlns:w16se="http://schemas.microsoft.com/office/word/2015/wordml/symex" xmlns:wpg="http://schemas.microsoft.com/office/word/2010/wordprocessingGroup" xmlns:wpi="http://schemas.microsoft.com/office/word/2010/wordprocessingInk" xmlns:wne="http://schemas.microsoft.com/office/word/2006/wordml" xmlns:wps="http://schemas.microsoft.com/office/word/2010/wordprocessingShape" mc:Ignorable="w14 w15 w16se w16cid w16 w16cex w16sdtdh w16sdtfl w16du wp14">
-  <w:comment w:id="0" w:author="dos Santos Junior, Jose Cassio" w:date="2026-03-17T13:57:00Z" w:initials="dSJJC">
-    <w:p>
-      <w:r>
-        <w:rPr>
-          <w:rStyle w:val="CommentReference"/>
-        </w:rPr>
-        <w:annotationRef/>
-      </w:r>
-      <w:r>
-        <w:rPr>
-          <w:sz w:val="20"/>
-          <w:szCs w:val="20"/>
-        </w:rPr>
-        <w:t>flask not showing in this command. Looking at it</w:t>
-      </w:r>
-    </w:p>
-  </w:comment>
-</w:comments>
-</file>
-
-<file path=word/commentsExtended.xml><?xml version="1.0" encoding="utf-8"?>
-<w15:commentsEx xmlns:wpc="http://schemas.microsoft.com/office/word/2010/wordprocessingCanvas" xmlns:cx="http://schemas.microsoft.com/office/drawing/2014/chartex" xmlns:cx1="http://schemas.microsoft.com/office/drawing/2015/9/8/chartex" xmlns:cx2="http://schemas.microsoft.com/office/drawing/2015/10/21/chartex" xmlns:cx3="http://schemas.microsoft.com/office/drawing/2016/5/9/chartex" xmlns:cx4="http://schemas.microsoft.com/office/drawing/2016/5/10/chartex" xmlns:cx5="http://schemas.microsoft.com/office/drawing/2016/5/11/chartex" xmlns:cx6="http://schemas.microsoft.com/office/drawing/2016/5/12/chartex" xmlns:cx7="http://schemas.microsoft.com/office/drawing/2016/5/13/chartex" xmlns:cx8="http://schemas.microsoft.com/office/drawing/2016/5/14/chartex" xmlns:mc="http://schemas.openxmlformats.org/markup-compatibility/2006" xmlns:aink="http://schemas.microsoft.com/office/drawing/2016/ink" xmlns:am3d="http://schemas.microsoft.com/office/drawing/2017/model3d" xmlns:o="urn:schemas-microsoft-com:office:office" xmlns:oel="http://schemas.microsoft.com/office/2019/extlst" xmlns:r="http://schemas.openxmlformats.org/officeDocument/2006/relationships" xmlns:m="http://schemas.openxmlformats.org/officeDocument/2006/math" xmlns:v="urn:schemas-microsoft-com:vml" xmlns:wp14="http://schemas.microsoft.com/office/word/2010/wordprocessingDrawing" xmlns:wp="http://schemas.openxmlformats.org/drawingml/2006/wordprocessingDrawing" xmlns:w10="urn:schemas-microsoft-com:office:word" xmlns:w="http://schemas.openxmlformats.org/wordprocessingml/2006/main" xmlns:w14="http://schemas.microsoft.com/office/word/2010/wordml" xmlns:w15="http://schemas.microsoft.com/office/word/2012/wordml" xmlns:w16cex="http://schemas.microsoft.com/office/word/2018/wordml/cex" xmlns:w16cid="http://schemas.microsoft.com/office/word/2016/wordml/cid" xmlns:w16="http://schemas.microsoft.com/office/word/2018/wordml" xmlns:w16du="http://schemas.microsoft.com/office/word/2023/wordml/word16du" xmlns:w16sdtdh="http://schemas.microsoft.com/office/word/2020/wordml/sdtdatahash" xmlns:w16sdtfl="http://schemas.microsoft.com/office/word/2024/wordml/sdtformatlock" xmlns:w16se="http://schemas.microsoft.com/office/word/2015/wordml/symex" xmlns:wpg="http://schemas.microsoft.com/office/word/2010/wordprocessingGroup" xmlns:wpi="http://schemas.microsoft.com/office/word/2010/wordprocessingInk" xmlns:wne="http://schemas.microsoft.com/office/word/2006/wordml" xmlns:wps="http://schemas.microsoft.com/office/word/2010/wordprocessingShape" mc:Ignorable="w14 w15 w16se w16cid w16 w16cex w16sdtdh w16sdtfl w16du wp14">
-  <w15:commentEx w15:paraId="66DB90FF" w15:done="0"/>
-</w15:commentsEx>
-</file>
-
-<file path=word/commentsExtensible.xml><?xml version="1.0" encoding="utf-8"?>
-<w16cex:commentsExtensible xmlns:wpc="http://schemas.microsoft.com/office/word/2010/wordprocessingCanvas" xmlns:cx="http://schemas.microsoft.com/office/drawing/2014/chartex" xmlns:cx1="http://schemas.microsoft.com/office/drawing/2015/9/8/chartex" xmlns:cx2="http://schemas.microsoft.com/office/drawing/2015/10/21/chartex" xmlns:cx3="http://schemas.microsoft.com/office/drawing/2016/5/9/chartex" xmlns:cx4="http://schemas.microsoft.com/office/drawing/2016/5/10/chartex" xmlns:cx5="http://schemas.microsoft.com/office/drawing/2016/5/11/chartex" xmlns:cx6="http://schemas.microsoft.com/office/drawing/2016/5/12/chartex" xmlns:cx7="http://schemas.microsoft.com/office/drawing/2016/5/13/chartex" xmlns:cx8="http://schemas.microsoft.com/office/drawing/2016/5/14/chartex" xmlns:cr="http://schemas.microsoft.com/office/comments/2020/reactions" xmlns:mc="http://schemas.openxmlformats.org/markup-compatibility/2006" xmlns:aink="http://schemas.microsoft.com/office/drawing/2016/ink" xmlns:am3d="http://schemas.microsoft.com/office/drawing/2017/model3d" xmlns:o="urn:schemas-microsoft-com:office:office" xmlns:oel="http://schemas.microsoft.com/office/2019/extlst" xmlns:r="http://schemas.openxmlformats.org/officeDocument/2006/relationships" xmlns:m="http://schemas.openxmlformats.org/officeDocument/2006/math" xmlns:v="urn:schemas-microsoft-com:vml" xmlns:wp14="http://schemas.microsoft.com/office/word/2010/wordprocessingDrawing" xmlns:wp="http://schemas.openxmlformats.org/drawingml/2006/wordprocessingDrawing" xmlns:w10="urn:schemas-microsoft-com:office:word" xmlns:w="http://schemas.openxmlformats.org/wordprocessingml/2006/main" xmlns:w14="http://schemas.microsoft.com/office/word/2010/wordml" xmlns:w15="http://schemas.microsoft.com/office/word/2012/wordml" xmlns:w16cex="http://schemas.microsoft.com/office/word/2018/wordml/cex" xmlns:w16cid="http://schemas.microsoft.com/office/word/2016/wordml/cid" xmlns:w16="http://schemas.microsoft.com/office/word/2018/wordml" xmlns:w16du="http://schemas.microsoft.com/office/word/2023/wordml/word16du" xmlns:w16sdtdh="http://schemas.microsoft.com/office/word/2020/wordml/sdtdatahash" xmlns:w16sdtfl="http://schemas.microsoft.com/office/word/2024/wordml/sdtformatlock" xmlns:w16se="http://schemas.microsoft.com/office/word/2015/wordml/symex" xmlns:wpg="http://schemas.microsoft.com/office/word/2010/wordprocessingGroup" xmlns:wpi="http://schemas.microsoft.com/office/word/2010/wordprocessingInk" xmlns:wne="http://schemas.microsoft.com/office/word/2006/wordml" xmlns:wps="http://schemas.microsoft.com/office/word/2010/wordprocessingShape" mc:Ignorable="w14 w15 w16se w16cid w16 w16cex w16sdtdh w16sdtfl cr w16du wp14">
-  <w16cex:commentExtensible w16cex:durableId="02FBF472" w16cex:dateUtc="2026-03-17T20:57:00Z"/>
-</w16cex:commentsExtensible>
-</file>
-
-<file path=word/commentsIds.xml><?xml version="1.0" encoding="utf-8"?>
-<w16cid:commentsIds xmlns:wpc="http://schemas.microsoft.com/office/word/2010/wordprocessingCanvas" xmlns:cx="http://schemas.microsoft.com/office/drawing/2014/chartex" xmlns:cx1="http://schemas.microsoft.com/office/drawing/2015/9/8/chartex" xmlns:cx2="http://schemas.microsoft.com/office/drawing/2015/10/21/chartex" xmlns:cx3="http://schemas.microsoft.com/office/drawing/2016/5/9/chartex" xmlns:cx4="http://schemas.microsoft.com/office/drawing/2016/5/10/chartex" xmlns:cx5="http://schemas.microsoft.com/office/drawing/2016/5/11/chartex" xmlns:cx6="http://schemas.microsoft.com/office/drawing/2016/5/12/chartex" xmlns:cx7="http://schemas.microsoft.com/office/drawing/2016/5/13/chartex" xmlns:cx8="http://schemas.microsoft.com/office/drawing/2016/5/14/chartex" xmlns:mc="http://schemas.openxmlformats.org/markup-compatibility/2006" xmlns:aink="http://schemas.microsoft.com/office/drawing/2016/ink" xmlns:am3d="http://schemas.microsoft.com/office/drawing/2017/model3d" xmlns:o="urn:schemas-microsoft-com:office:office" xmlns:oel="http://schemas.microsoft.com/office/2019/extlst" xmlns:r="http://schemas.openxmlformats.org/officeDocument/2006/relationships" xmlns:m="http://schemas.openxmlformats.org/officeDocument/2006/math" xmlns:v="urn:schemas-microsoft-com:vml" xmlns:wp14="http://schemas.microsoft.com/office/word/2010/wordprocessingDrawing" xmlns:wp="http://schemas.openxmlformats.org/drawingml/2006/wordprocessingDrawing" xmlns:w10="urn:schemas-microsoft-com:office:word" xmlns:w="http://schemas.openxmlformats.org/wordprocessingml/2006/main" xmlns:w14="http://schemas.microsoft.com/office/word/2010/wordml" xmlns:w15="http://schemas.microsoft.com/office/word/2012/wordml" xmlns:w16cex="http://schemas.microsoft.com/office/word/2018/wordml/cex" xmlns:w16cid="http://schemas.microsoft.com/office/word/2016/wordml/cid" xmlns:w16="http://schemas.microsoft.com/office/word/2018/wordml" xmlns:w16du="http://schemas.microsoft.com/office/word/2023/wordml/word16du" xmlns:w16sdtdh="http://schemas.microsoft.com/office/word/2020/wordml/sdtdatahash" xmlns:w16sdtfl="http://schemas.microsoft.com/office/word/2024/wordml/sdtformatlock" xmlns:w16se="http://schemas.microsoft.com/office/word/2015/wordml/symex" xmlns:wpg="http://schemas.microsoft.com/office/word/2010/wordprocessingGroup" xmlns:wpi="http://schemas.microsoft.com/office/word/2010/wordprocessingInk" xmlns:wne="http://schemas.microsoft.com/office/word/2006/wordml" xmlns:wps="http://schemas.microsoft.com/office/word/2010/wordprocessingShape" mc:Ignorable="w14 w15 w16se w16cid w16 w16cex w16sdtdh w16sdtfl w16du wp14">
-  <w16cid:commentId w16cid:paraId="66DB90FF" w16cid:durableId="02FBF472"/>
-</w16cid:commentsIds>
 </file>
 
 <file path=word/numbering.xml><?xml version="1.0" encoding="utf-8"?>
@@ -21599,14 +22519,6 @@
     <w:abstractNumId w:val="26"/>
   </w:num>
 </w:numbering>
-</file>
-
-<file path=word/people.xml><?xml version="1.0" encoding="utf-8"?>
-<w15:people xmlns:wpc="http://schemas.microsoft.com/office/word/2010/wordprocessingCanvas" xmlns:cx="http://schemas.microsoft.com/office/drawing/2014/chartex" xmlns:cx1="http://schemas.microsoft.com/office/drawing/2015/9/8/chartex" xmlns:cx2="http://schemas.microsoft.com/office/drawing/2015/10/21/chartex" xmlns:cx3="http://schemas.microsoft.com/office/drawing/2016/5/9/chartex" xmlns:cx4="http://schemas.microsoft.com/office/drawing/2016/5/10/chartex" xmlns:cx5="http://schemas.microsoft.com/office/drawing/2016/5/11/chartex" xmlns:cx6="http://schemas.microsoft.com/office/drawing/2016/5/12/chartex" xmlns:cx7="http://schemas.microsoft.com/office/drawing/2016/5/13/chartex" xmlns:cx8="http://schemas.microsoft.com/office/drawing/2016/5/14/chartex" xmlns:mc="http://schemas.openxmlformats.org/markup-compatibility/2006" xmlns:aink="http://schemas.microsoft.com/office/drawing/2016/ink" xmlns:am3d="http://schemas.microsoft.com/office/drawing/2017/model3d" xmlns:o="urn:schemas-microsoft-com:office:office" xmlns:oel="http://schemas.microsoft.com/office/2019/extlst" xmlns:r="http://schemas.openxmlformats.org/officeDocument/2006/relationships" xmlns:m="http://schemas.openxmlformats.org/officeDocument/2006/math" xmlns:v="urn:schemas-microsoft-com:vml" xmlns:wp14="http://schemas.microsoft.com/office/word/2010/wordprocessingDrawing" xmlns:wp="http://schemas.openxmlformats.org/drawingml/2006/wordprocessingDrawing" xmlns:w10="urn:schemas-microsoft-com:office:word" xmlns:w="http://schemas.openxmlformats.org/wordprocessingml/2006/main" xmlns:w14="http://schemas.microsoft.com/office/word/2010/wordml" xmlns:w15="http://schemas.microsoft.com/office/word/2012/wordml" xmlns:w16cex="http://schemas.microsoft.com/office/word/2018/wordml/cex" xmlns:w16cid="http://schemas.microsoft.com/office/word/2016/wordml/cid" xmlns:w16="http://schemas.microsoft.com/office/word/2018/wordml" xmlns:w16du="http://schemas.microsoft.com/office/word/2023/wordml/word16du" xmlns:w16sdtdh="http://schemas.microsoft.com/office/word/2020/wordml/sdtdatahash" xmlns:w16sdtfl="http://schemas.microsoft.com/office/word/2024/wordml/sdtformatlock" xmlns:w16se="http://schemas.microsoft.com/office/word/2015/wordml/symex" xmlns:wpg="http://schemas.microsoft.com/office/word/2010/wordprocessingGroup" xmlns:wpi="http://schemas.microsoft.com/office/word/2010/wordprocessingInk" xmlns:wne="http://schemas.microsoft.com/office/word/2006/wordml" xmlns:wps="http://schemas.microsoft.com/office/word/2010/wordprocessingShape" mc:Ignorable="w14 w15 w16se w16cid w16 w16cex w16sdtdh w16sdtfl w16du wp14">
-  <w15:person w15:author="dos Santos Junior, Jose Cassio">
-    <w15:presenceInfo w15:providerId="AD" w15:userId="S::jcsantos@amazon.com::af0e788e-37db-4630-baa1-2a57e9b3177b"/>
-  </w15:person>
-</w15:people>
 </file>
 
 <file path=word/styles.xml><?xml version="1.0" encoding="utf-8"?>
@@ -23039,17 +23951,6 @@
 </file>
 
 <file path=customXml/item1.xml><?xml version="1.0" encoding="utf-8"?>
-<p:properties xmlns:p="http://schemas.microsoft.com/office/2006/metadata/properties" xmlns:xsi="http://www.w3.org/2001/XMLSchema-instance" xmlns:pc="http://schemas.microsoft.com/office/infopath/2007/PartnerControls">
-  <documentManagement>
-    <TaxCatchAll xmlns="a161c079-57a4-46e0-a69b-a5a77b45dd11" xsi:nil="true"/>
-    <lcf76f155ced4ddcb4097134ff3c332f xmlns="20de49a9-f81a-4c8d-ae58-57062fbfdfc2">
-      <Terms xmlns="http://schemas.microsoft.com/office/infopath/2007/PartnerControls"/>
-    </lcf76f155ced4ddcb4097134ff3c332f>
-  </documentManagement>
-</p:properties>
-</file>
-
-<file path=customXml/item2.xml><?xml version="1.0" encoding="utf-8"?>
 <ct:contentTypeSchema xmlns:ct="http://schemas.microsoft.com/office/2006/metadata/contentType" xmlns:ma="http://schemas.microsoft.com/office/2006/metadata/properties/metaAttributes" ct:_="" ma:_="" ma:contentTypeName="Document" ma:contentTypeID="0x010100DEBE6A1BFB4CA9468D84B125F7C1F0C7" ma:contentTypeVersion="13" ma:contentTypeDescription="Create a new document." ma:contentTypeScope="" ma:versionID="b06231669be6eb5acc96978dd5a15ea7">
   <xsd:schema xmlns:xsd="http://www.w3.org/2001/XMLSchema" xmlns:xs="http://www.w3.org/2001/XMLSchema" xmlns:p="http://schemas.microsoft.com/office/2006/metadata/properties" xmlns:ns2="20de49a9-f81a-4c8d-ae58-57062fbfdfc2" xmlns:ns3="a161c079-57a4-46e0-a69b-a5a77b45dd11" targetNamespace="http://schemas.microsoft.com/office/2006/metadata/properties" ma:root="true" ma:fieldsID="d162d1fd4d017f512fcee4f8287bc6c9" ns2:_="" ns3:_="">
     <xsd:import namespace="20de49a9-f81a-4c8d-ae58-57062fbfdfc2"/>
@@ -23256,7 +24157,7 @@
 </ct:contentTypeSchema>
 </file>
 
-<file path=customXml/item3.xml><?xml version="1.0" encoding="utf-8"?>
+<file path=customXml/item2.xml><?xml version="1.0" encoding="utf-8"?>
 <?mso-contentType ?>
 <FormTemplates xmlns="http://schemas.microsoft.com/sharepoint/v3/contenttype/forms">
   <Display>DocumentLibraryForm</Display>
@@ -23265,18 +24166,18 @@
 </FormTemplates>
 </file>
 
-<file path=customXml/itemProps1.xml><?xml version="1.0" encoding="utf-8"?>
-<ds:datastoreItem xmlns:ds="http://schemas.openxmlformats.org/officeDocument/2006/customXml" ds:itemID="{7C276142-2813-4642-A736-C58AABDCD39A}">
-  <ds:schemaRefs>
-    <ds:schemaRef ds:uri="http://schemas.microsoft.com/office/2006/metadata/properties"/>
-    <ds:schemaRef ds:uri="http://schemas.microsoft.com/office/infopath/2007/PartnerControls"/>
-    <ds:schemaRef ds:uri="a161c079-57a4-46e0-a69b-a5a77b45dd11"/>
-    <ds:schemaRef ds:uri="20de49a9-f81a-4c8d-ae58-57062fbfdfc2"/>
-  </ds:schemaRefs>
-</ds:datastoreItem>
+<file path=customXml/item3.xml><?xml version="1.0" encoding="utf-8"?>
+<p:properties xmlns:p="http://schemas.microsoft.com/office/2006/metadata/properties" xmlns:xsi="http://www.w3.org/2001/XMLSchema-instance" xmlns:pc="http://schemas.microsoft.com/office/infopath/2007/PartnerControls">
+  <documentManagement>
+    <TaxCatchAll xmlns="a161c079-57a4-46e0-a69b-a5a77b45dd11" xsi:nil="true"/>
+    <lcf76f155ced4ddcb4097134ff3c332f xmlns="20de49a9-f81a-4c8d-ae58-57062fbfdfc2">
+      <Terms xmlns="http://schemas.microsoft.com/office/infopath/2007/PartnerControls"/>
+    </lcf76f155ced4ddcb4097134ff3c332f>
+  </documentManagement>
+</p:properties>
 </file>
 
-<file path=customXml/itemProps2.xml><?xml version="1.0" encoding="utf-8"?>
+<file path=customXml/itemProps1.xml><?xml version="1.0" encoding="utf-8"?>
 <ds:datastoreItem xmlns:ds="http://schemas.openxmlformats.org/officeDocument/2006/customXml" ds:itemID="{531D27EF-AE38-4883-8B5C-2060C59A2D2E}">
   <ds:schemaRefs>
     <ds:schemaRef ds:uri="http://schemas.microsoft.com/office/2006/metadata/contentType"/>
@@ -23295,10 +24196,21 @@
 </ds:datastoreItem>
 </file>
 
-<file path=customXml/itemProps3.xml><?xml version="1.0" encoding="utf-8"?>
+<file path=customXml/itemProps2.xml><?xml version="1.0" encoding="utf-8"?>
 <ds:datastoreItem xmlns:ds="http://schemas.openxmlformats.org/officeDocument/2006/customXml" ds:itemID="{4A291C17-8278-47D9-BB51-7C6B5807A8F4}">
   <ds:schemaRefs>
     <ds:schemaRef ds:uri="http://schemas.microsoft.com/sharepoint/v3/contenttype/forms"/>
   </ds:schemaRefs>
 </ds:datastoreItem>
+</file>
+
+<file path=customXml/itemProps3.xml><?xml version="1.0" encoding="utf-8"?>
+<ds:datastoreItem xmlns:ds="http://schemas.openxmlformats.org/officeDocument/2006/customXml" ds:itemID="{7C276142-2813-4642-A736-C58AABDCD39A}">
+  <ds:schemaRefs>
+    <ds:schemaRef ds:uri="http://schemas.microsoft.com/office/2006/metadata/properties"/>
+    <ds:schemaRef ds:uri="http://schemas.microsoft.com/office/infopath/2007/PartnerControls"/>
+    <ds:schemaRef ds:uri="a161c079-57a4-46e0-a69b-a5a77b45dd11"/>
+    <ds:schemaRef ds:uri="20de49a9-f81a-4c8d-ae58-57062fbfdfc2"/>
+  </ds:schemaRefs>
+</ds:datastoreItem>
 </file>
</xml_diff>